<commit_message>
docs: añadir plan de gestión de recursos y corregir estilos
</commit_message>
<xml_diff>
--- a/Documentacion/Planificacion/Lineas Base/EDT.docx
+++ b/Documentacion/Planificacion/Lineas Base/EDT.docx
@@ -2,17 +2,6 @@
 <file path=word/document.xml><?xml version="1.0" encoding="utf-8"?>
 <w:document xmlns:wpc="http://schemas.microsoft.com/office/word/2010/wordprocessingCanvas" xmlns:cx="http://schemas.microsoft.com/office/drawing/2014/chartex" xmlns:cx1="http://schemas.microsoft.com/office/drawing/2015/9/8/chartex" xmlns:cx2="http://schemas.microsoft.com/office/drawing/2015/10/21/chartex" xmlns:cx3="http://schemas.microsoft.com/office/drawing/2016/5/9/chartex" xmlns:cx4="http://schemas.microsoft.com/office/drawing/2016/5/10/chartex" xmlns:cx5="http://schemas.microsoft.com/office/drawing/2016/5/11/chartex" xmlns:cx6="http://schemas.microsoft.com/office/drawing/2016/5/12/chartex" xmlns:cx7="http://schemas.microsoft.com/office/drawing/2016/5/13/chartex" xmlns:cx8="http://schemas.microsoft.com/office/drawing/2016/5/14/chartex" xmlns:mc="http://schemas.openxmlformats.org/markup-compatibility/2006" xmlns:aink="http://schemas.microsoft.com/office/drawing/2016/ink" xmlns:am3d="http://schemas.microsoft.com/office/drawing/2017/model3d" xmlns:o="urn:schemas-microsoft-com:office:office" xmlns:oel="http://schemas.microsoft.com/office/2019/extlst" xmlns:r="http://schemas.openxmlformats.org/officeDocument/2006/relationships" xmlns:m="http://schemas.openxmlformats.org/officeDocument/2006/math" xmlns:v="urn:schemas-microsoft-com:vml" xmlns:wp14="http://schemas.microsoft.com/office/word/2010/wordprocessingDrawing" xmlns:wp="http://schemas.openxmlformats.org/drawingml/2006/wordprocessingDrawing" xmlns:w10="urn:schemas-microsoft-com:office:word" xmlns:w="http://schemas.openxmlformats.org/wordprocessingml/2006/main" xmlns:w14="http://schemas.microsoft.com/office/word/2010/wordml" xmlns:w15="http://schemas.microsoft.com/office/word/2012/wordml" xmlns:w16cex="http://schemas.microsoft.com/office/word/2018/wordml/cex" xmlns:w16cid="http://schemas.microsoft.com/office/word/2016/wordml/cid" xmlns:w16="http://schemas.microsoft.com/office/word/2018/wordml" xmlns:w16du="http://schemas.microsoft.com/office/word/2023/wordml/word16du" xmlns:w16sdtdh="http://schemas.microsoft.com/office/word/2020/wordml/sdtdatahash" xmlns:w16sdtfl="http://schemas.microsoft.com/office/word/2024/wordml/sdtformatlock" xmlns:w16se="http://schemas.microsoft.com/office/word/2015/wordml/symex" xmlns:wpg="http://schemas.microsoft.com/office/word/2010/wordprocessingGroup" xmlns:wpi="http://schemas.microsoft.com/office/word/2010/wordprocessingInk" xmlns:wne="http://schemas.microsoft.com/office/word/2006/wordml" xmlns:wps="http://schemas.microsoft.com/office/word/2010/wordprocessingShape" mc:Ignorable="w14 w15 w16se w16cid w16 w16cex w16sdtdh w16sdtfl w16du wp14">
   <w:body>
-    <w:p>
-      <w:pPr>
-        <w:spacing w:after="0"/>
-        <w:rPr>
-          <w:sz w:val="20"/>
-          <w:lang w:val="es-PA"/>
-        </w:rPr>
-      </w:pPr>
-      <w:bookmarkStart w:id="0" w:name="_Hlk177494917"/>
-      <w:bookmarkEnd w:id="0"/>
-    </w:p>
     <w:tbl>
       <w:tblPr>
         <w:tblStyle w:val="Tablaconcuadrcula"/>
@@ -20,35 +9,44 @@
         <w:tblLook w:val="04A0" w:firstRow="1" w:lastRow="0" w:firstColumn="1" w:lastColumn="0" w:noHBand="0" w:noVBand="1"/>
       </w:tblPr>
       <w:tblGrid>
-        <w:gridCol w:w="1112"/>
-        <w:gridCol w:w="5559"/>
-        <w:gridCol w:w="1257"/>
-        <w:gridCol w:w="2635"/>
-        <w:gridCol w:w="1427"/>
-        <w:gridCol w:w="2400"/>
+        <w:gridCol w:w="1309"/>
+        <w:gridCol w:w="4567"/>
+        <w:gridCol w:w="1743"/>
+        <w:gridCol w:w="2403"/>
+        <w:gridCol w:w="1694"/>
+        <w:gridCol w:w="2263"/>
       </w:tblGrid>
       <w:tr>
+        <w:trPr>
+          <w:trHeight w:val="498"/>
+        </w:trPr>
         <w:tc>
           <w:tcPr>
-            <w:tcW w:w="1112" w:type="dxa"/>
+            <w:tcW w:w="1309" w:type="dxa"/>
+            <w:tcBorders>
+              <w:top w:val="single" w:sz="4" w:space="0" w:color="auto"/>
+              <w:left w:val="single" w:sz="4" w:space="0" w:color="auto"/>
+              <w:bottom w:val="single" w:sz="4" w:space="0" w:color="auto"/>
+              <w:right w:val="single" w:sz="4" w:space="0" w:color="auto"/>
+            </w:tcBorders>
             <w:shd w:val="clear" w:color="auto" w:fill="D9D9D9" w:themeFill="background1" w:themeFillShade="D9"/>
             <w:vAlign w:val="center"/>
+            <w:hideMark/>
           </w:tcPr>
           <w:p>
             <w:pPr>
-              <w:spacing w:after="0"/>
-              <w:jc w:val="center"/>
+              <w:spacing w:line="278" w:lineRule="auto"/>
               <w:rPr>
                 <w:b/>
                 <w:sz w:val="20"/>
-                <w:lang w:val="es-PA"/>
+                <w:szCs w:val="24"/>
               </w:rPr>
             </w:pPr>
             <w:r>
               <w:rPr>
                 <w:b/>
                 <w:sz w:val="20"/>
-                <w:lang w:val="es-PA"/>
+                <w:szCs w:val="24"/>
               </w:rPr>
               <w:t>PROYECTO</w:t>
             </w:r>
@@ -56,107 +54,107 @@
         </w:tc>
         <w:tc>
           <w:tcPr>
-            <w:tcW w:w="5656" w:type="dxa"/>
+            <w:tcW w:w="4567" w:type="dxa"/>
+            <w:tcBorders>
+              <w:top w:val="single" w:sz="4" w:space="0" w:color="auto"/>
+              <w:left w:val="single" w:sz="4" w:space="0" w:color="auto"/>
+              <w:bottom w:val="single" w:sz="4" w:space="0" w:color="auto"/>
+              <w:right w:val="single" w:sz="4" w:space="0" w:color="auto"/>
+            </w:tcBorders>
             <w:vAlign w:val="center"/>
           </w:tcPr>
           <w:p>
             <w:pPr>
-              <w:spacing w:after="0"/>
-              <w:jc w:val="center"/>
+              <w:spacing w:line="278" w:lineRule="auto"/>
+              <w:rPr>
+                <w:bCs/>
+                <w:sz w:val="20"/>
+                <w:szCs w:val="24"/>
+              </w:rPr>
+            </w:pPr>
+            <w:r>
+              <w:rPr>
+                <w:bCs/>
+                <w:sz w:val="20"/>
+                <w:szCs w:val="24"/>
+              </w:rPr>
+              <w:t xml:space="preserve">Rise </w:t>
+            </w:r>
+            <w:proofErr w:type="spellStart"/>
+            <w:r>
+              <w:rPr>
+                <w:bCs/>
+                <w:sz w:val="20"/>
+                <w:szCs w:val="24"/>
+              </w:rPr>
+              <w:t>of</w:t>
+            </w:r>
+            <w:proofErr w:type="spellEnd"/>
+            <w:r>
+              <w:rPr>
+                <w:bCs/>
+                <w:sz w:val="20"/>
+                <w:szCs w:val="24"/>
+              </w:rPr>
+              <w:t xml:space="preserve"> The </w:t>
+            </w:r>
+            <w:proofErr w:type="spellStart"/>
+            <w:r>
+              <w:rPr>
+                <w:bCs/>
+                <w:sz w:val="20"/>
+                <w:szCs w:val="24"/>
+              </w:rPr>
+              <w:t>Lost</w:t>
+            </w:r>
+            <w:proofErr w:type="spellEnd"/>
+            <w:r>
+              <w:rPr>
+                <w:bCs/>
+                <w:sz w:val="20"/>
+                <w:szCs w:val="24"/>
+              </w:rPr>
+              <w:t xml:space="preserve"> </w:t>
+            </w:r>
+            <w:proofErr w:type="spellStart"/>
+            <w:r>
+              <w:rPr>
+                <w:bCs/>
+                <w:sz w:val="20"/>
+                <w:szCs w:val="24"/>
+              </w:rPr>
+              <w:t>Colors</w:t>
+            </w:r>
+            <w:proofErr w:type="spellEnd"/>
+          </w:p>
+        </w:tc>
+        <w:tc>
+          <w:tcPr>
+            <w:tcW w:w="1743" w:type="dxa"/>
+            <w:tcBorders>
+              <w:top w:val="single" w:sz="4" w:space="0" w:color="auto"/>
+              <w:left w:val="single" w:sz="4" w:space="0" w:color="auto"/>
+              <w:bottom w:val="single" w:sz="4" w:space="0" w:color="auto"/>
+              <w:right w:val="single" w:sz="4" w:space="0" w:color="auto"/>
+            </w:tcBorders>
+            <w:shd w:val="clear" w:color="auto" w:fill="D9D9D9" w:themeFill="background1" w:themeFillShade="D9"/>
+            <w:vAlign w:val="center"/>
+            <w:hideMark/>
+          </w:tcPr>
+          <w:p>
+            <w:pPr>
+              <w:spacing w:line="278" w:lineRule="auto"/>
               <w:rPr>
                 <w:b/>
                 <w:sz w:val="20"/>
-                <w:lang w:val="es-PA"/>
+                <w:szCs w:val="24"/>
               </w:rPr>
             </w:pPr>
             <w:r>
               <w:rPr>
                 <w:b/>
                 <w:sz w:val="20"/>
-                <w:lang w:val="es-PA"/>
-              </w:rPr>
-              <w:t xml:space="preserve">Rise </w:t>
-            </w:r>
-            <w:proofErr w:type="spellStart"/>
-            <w:r>
-              <w:rPr>
-                <w:b/>
-                <w:sz w:val="20"/>
-                <w:lang w:val="es-PA"/>
-              </w:rPr>
-              <w:t>of</w:t>
-            </w:r>
-            <w:proofErr w:type="spellEnd"/>
-            <w:r>
-              <w:rPr>
-                <w:b/>
-                <w:sz w:val="20"/>
-                <w:lang w:val="es-PA"/>
-              </w:rPr>
-              <w:t xml:space="preserve"> The </w:t>
-            </w:r>
-            <w:proofErr w:type="spellStart"/>
-            <w:r>
-              <w:rPr>
-                <w:b/>
-                <w:sz w:val="20"/>
-                <w:lang w:val="es-PA"/>
-              </w:rPr>
-              <w:t>Lost</w:t>
-            </w:r>
-            <w:proofErr w:type="spellEnd"/>
-            <w:r>
-              <w:rPr>
-                <w:b/>
-                <w:sz w:val="20"/>
-                <w:lang w:val="es-PA"/>
-              </w:rPr>
-              <w:t xml:space="preserve"> </w:t>
-            </w:r>
-            <w:proofErr w:type="spellStart"/>
-            <w:r>
-              <w:rPr>
-                <w:b/>
-                <w:sz w:val="20"/>
-                <w:lang w:val="es-PA"/>
-              </w:rPr>
-              <w:t>Colors</w:t>
-            </w:r>
-            <w:proofErr w:type="spellEnd"/>
-          </w:p>
-          <w:p>
-            <w:pPr>
-              <w:spacing w:after="0"/>
-              <w:jc w:val="center"/>
-              <w:rPr>
-                <w:b/>
-                <w:sz w:val="20"/>
-                <w:lang w:val="es-PA"/>
-              </w:rPr>
-            </w:pPr>
-          </w:p>
-        </w:tc>
-        <w:tc>
-          <w:tcPr>
-            <w:tcW w:w="1260" w:type="dxa"/>
-            <w:shd w:val="clear" w:color="auto" w:fill="D9D9D9" w:themeFill="background1" w:themeFillShade="D9"/>
-            <w:vAlign w:val="center"/>
-          </w:tcPr>
-          <w:p>
-            <w:pPr>
-              <w:spacing w:after="0"/>
-              <w:jc w:val="center"/>
-              <w:rPr>
-                <w:b/>
-                <w:sz w:val="20"/>
-                <w:lang w:val="es-PA"/>
-              </w:rPr>
-            </w:pPr>
-            <w:r>
-              <w:rPr>
-                <w:b/>
-                <w:sz w:val="20"/>
-                <w:lang w:val="es-PA"/>
+                <w:szCs w:val="24"/>
               </w:rPr>
               <w:t>CÓDIGO DE PROYECTO</w:t>
             </w:r>
@@ -164,24 +162,30 @@
         </w:tc>
         <w:tc>
           <w:tcPr>
-            <w:tcW w:w="2675" w:type="dxa"/>
+            <w:tcW w:w="2403" w:type="dxa"/>
+            <w:tcBorders>
+              <w:top w:val="single" w:sz="4" w:space="0" w:color="auto"/>
+              <w:left w:val="single" w:sz="4" w:space="0" w:color="auto"/>
+              <w:bottom w:val="single" w:sz="4" w:space="0" w:color="auto"/>
+              <w:right w:val="single" w:sz="4" w:space="0" w:color="auto"/>
+            </w:tcBorders>
             <w:vAlign w:val="center"/>
+            <w:hideMark/>
           </w:tcPr>
           <w:p>
             <w:pPr>
-              <w:spacing w:after="0"/>
-              <w:jc w:val="center"/>
+              <w:spacing w:line="278" w:lineRule="auto"/>
               <w:rPr>
-                <w:b/>
+                <w:bCs/>
                 <w:sz w:val="20"/>
-                <w:lang w:val="es-PA"/>
+                <w:szCs w:val="24"/>
               </w:rPr>
             </w:pPr>
             <w:r>
               <w:rPr>
-                <w:b/>
+                <w:bCs/>
                 <w:sz w:val="20"/>
-                <w:lang w:val="es-PA"/>
+                <w:szCs w:val="24"/>
               </w:rPr>
               <w:t>RLC-2026</w:t>
             </w:r>
@@ -189,25 +193,31 @@
         </w:tc>
         <w:tc>
           <w:tcPr>
-            <w:tcW w:w="1427" w:type="dxa"/>
+            <w:tcW w:w="1694" w:type="dxa"/>
+            <w:tcBorders>
+              <w:top w:val="single" w:sz="4" w:space="0" w:color="auto"/>
+              <w:left w:val="single" w:sz="4" w:space="0" w:color="auto"/>
+              <w:bottom w:val="single" w:sz="4" w:space="0" w:color="auto"/>
+              <w:right w:val="single" w:sz="4" w:space="0" w:color="auto"/>
+            </w:tcBorders>
             <w:shd w:val="clear" w:color="auto" w:fill="D9D9D9" w:themeFill="background1" w:themeFillShade="D9"/>
             <w:vAlign w:val="center"/>
+            <w:hideMark/>
           </w:tcPr>
           <w:p>
             <w:pPr>
-              <w:spacing w:after="0"/>
-              <w:jc w:val="center"/>
+              <w:spacing w:line="278" w:lineRule="auto"/>
               <w:rPr>
                 <w:b/>
                 <w:sz w:val="20"/>
-                <w:lang w:val="es-PA"/>
+                <w:szCs w:val="24"/>
               </w:rPr>
             </w:pPr>
             <w:r>
               <w:rPr>
                 <w:b/>
                 <w:sz w:val="20"/>
-                <w:lang w:val="es-PA"/>
+                <w:szCs w:val="24"/>
               </w:rPr>
               <w:t>FECHA DE ELABORACIÓN</w:t>
             </w:r>
@@ -215,58 +225,32 @@
         </w:tc>
         <w:tc>
           <w:tcPr>
-            <w:tcW w:w="2424" w:type="dxa"/>
+            <w:tcW w:w="2263" w:type="dxa"/>
+            <w:tcBorders>
+              <w:top w:val="single" w:sz="4" w:space="0" w:color="auto"/>
+              <w:left w:val="single" w:sz="4" w:space="0" w:color="auto"/>
+              <w:bottom w:val="single" w:sz="4" w:space="0" w:color="auto"/>
+              <w:right w:val="single" w:sz="4" w:space="0" w:color="auto"/>
+            </w:tcBorders>
             <w:vAlign w:val="center"/>
+            <w:hideMark/>
           </w:tcPr>
           <w:p>
             <w:pPr>
-              <w:spacing w:after="0"/>
-              <w:jc w:val="center"/>
+              <w:spacing w:line="278" w:lineRule="auto"/>
               <w:rPr>
-                <w:b/>
+                <w:bCs/>
                 <w:sz w:val="20"/>
-                <w:lang w:val="es-PA"/>
+                <w:szCs w:val="24"/>
               </w:rPr>
             </w:pPr>
             <w:r>
               <w:rPr>
-                <w:b/>
+                <w:bCs/>
                 <w:sz w:val="20"/>
-                <w:lang w:val="es-PA"/>
+                <w:szCs w:val="24"/>
               </w:rPr>
-              <w:t>11</w:t>
-            </w:r>
-            <w:r>
-              <w:rPr>
-                <w:b/>
-                <w:sz w:val="20"/>
-                <w:lang w:val="es-PA"/>
-              </w:rPr>
-              <w:t>/</w:t>
-            </w:r>
-            <w:r>
-              <w:rPr>
-                <w:b/>
-                <w:sz w:val="20"/>
-                <w:lang w:val="es-PA"/>
-              </w:rPr>
-              <w:t>02</w:t>
-            </w:r>
-            <w:r>
-              <w:rPr>
-                <w:b/>
-                <w:sz w:val="20"/>
-                <w:lang w:val="es-PA"/>
-              </w:rPr>
-              <w:t>/202</w:t>
-            </w:r>
-            <w:r>
-              <w:rPr>
-                <w:b/>
-                <w:sz w:val="20"/>
-                <w:lang w:val="es-PA"/>
-              </w:rPr>
-              <w:t>6</w:t>
+              <w:t>11/02/2026</w:t>
             </w:r>
           </w:p>
         </w:tc>
@@ -274,20 +258,19 @@
     </w:tbl>
     <w:p>
       <w:pPr>
-        <w:spacing w:after="0"/>
         <w:rPr>
           <w:b/>
           <w:sz w:val="20"/>
+          <w:szCs w:val="24"/>
           <w:lang w:val="es-PA"/>
         </w:rPr>
       </w:pPr>
     </w:p>
     <w:p>
       <w:pPr>
-        <w:spacing w:after="0"/>
-        <w:jc w:val="center"/>
         <w:rPr>
           <w:sz w:val="20"/>
+          <w:szCs w:val="24"/>
           <w:lang w:val="es-PA"/>
         </w:rPr>
       </w:pPr>
@@ -295,13 +278,14 @@
         <w:rPr>
           <w:noProof/>
           <w:sz w:val="20"/>
+          <w:szCs w:val="24"/>
           <w:lang w:val="es-PA"/>
         </w:rPr>
         <w:drawing>
-          <wp:inline distT="0" distB="0" distL="0" distR="0" wp14:anchorId="07E4E0C3" wp14:editId="4A4048F8">
-            <wp:extent cx="9511169" cy="4457700"/>
-            <wp:effectExtent l="0" t="0" r="0" b="0"/>
-            <wp:docPr id="1602205468" name="Imagen 1" descr="Tabla&#10;&#10;El contenido generado por IA puede ser incorrecto."/>
+          <wp:inline distT="0" distB="0" distL="0" distR="0" wp14:anchorId="396AD12C" wp14:editId="5364365B">
+            <wp:extent cx="8892540" cy="4168140"/>
+            <wp:effectExtent l="0" t="0" r="3810" b="3810"/>
+            <wp:docPr id="1247073973" name="Imagen 3" descr="Tabla&#10;&#10;El contenido generado por IA puede ser incorrecto."/>
             <wp:cNvGraphicFramePr>
               <a:graphicFrameLocks xmlns:a="http://schemas.openxmlformats.org/drawingml/2006/main" noChangeAspect="1"/>
             </wp:cNvGraphicFramePr>
@@ -309,29 +293,36 @@
               <a:graphicData uri="http://schemas.openxmlformats.org/drawingml/2006/picture">
                 <pic:pic xmlns:pic="http://schemas.openxmlformats.org/drawingml/2006/picture">
                   <pic:nvPicPr>
-                    <pic:cNvPr id="1602205468" name="Imagen 1" descr="Tabla&#10;&#10;El contenido generado por IA puede ser incorrecto."/>
-                    <pic:cNvPicPr/>
+                    <pic:cNvPr id="0" name="Imagen 1" descr="Tabla&#10;&#10;El contenido generado por IA puede ser incorrecto."/>
+                    <pic:cNvPicPr>
+                      <a:picLocks noChangeAspect="1" noChangeArrowheads="1"/>
+                    </pic:cNvPicPr>
                   </pic:nvPicPr>
                   <pic:blipFill>
-                    <a:blip r:embed="rId6">
+                    <a:blip r:embed="rId7">
                       <a:extLst>
                         <a:ext uri="{28A0092B-C50C-407E-A947-70E740481C1C}">
                           <a14:useLocalDpi xmlns:a14="http://schemas.microsoft.com/office/drawing/2010/main" val="0"/>
                         </a:ext>
                       </a:extLst>
                     </a:blip>
+                    <a:srcRect/>
                     <a:stretch>
                       <a:fillRect/>
                     </a:stretch>
                   </pic:blipFill>
-                  <pic:spPr>
+                  <pic:spPr bwMode="auto">
                     <a:xfrm>
                       <a:off x="0" y="0"/>
-                      <a:ext cx="9513377" cy="4458735"/>
+                      <a:ext cx="8892540" cy="4168140"/>
                     </a:xfrm>
                     <a:prstGeom prst="rect">
                       <a:avLst/>
                     </a:prstGeom>
+                    <a:noFill/>
+                    <a:ln>
+                      <a:noFill/>
+                    </a:ln>
                   </pic:spPr>
                 </pic:pic>
               </a:graphicData>
@@ -340,11 +331,12 @@
         </w:drawing>
       </w:r>
     </w:p>
+    <w:p/>
     <w:sectPr>
-      <w:headerReference w:type="default" r:id="rId7"/>
-      <w:footerReference w:type="default" r:id="rId8"/>
-      <w:pgSz w:w="15840" w:h="12240" w:orient="landscape"/>
-      <w:pgMar w:top="720" w:right="720" w:bottom="720" w:left="720" w:header="708" w:footer="708" w:gutter="0"/>
+      <w:headerReference w:type="default" r:id="rId8"/>
+      <w:footerReference w:type="default" r:id="rId9"/>
+      <w:pgSz w:w="16838" w:h="11906" w:orient="landscape"/>
+      <w:pgMar w:top="1701" w:right="1417" w:bottom="1701" w:left="1417" w:header="708" w:footer="708" w:gutter="0"/>
       <w:cols w:space="708"/>
       <w:docGrid w:linePitch="360"/>
     </w:sectPr>
@@ -379,82 +371,197 @@
 
 <file path=word/footer1.xml><?xml version="1.0" encoding="utf-8"?>
 <w:ftr xmlns:wpc="http://schemas.microsoft.com/office/word/2010/wordprocessingCanvas" xmlns:cx="http://schemas.microsoft.com/office/drawing/2014/chartex" xmlns:cx1="http://schemas.microsoft.com/office/drawing/2015/9/8/chartex" xmlns:cx2="http://schemas.microsoft.com/office/drawing/2015/10/21/chartex" xmlns:cx3="http://schemas.microsoft.com/office/drawing/2016/5/9/chartex" xmlns:cx4="http://schemas.microsoft.com/office/drawing/2016/5/10/chartex" xmlns:cx5="http://schemas.microsoft.com/office/drawing/2016/5/11/chartex" xmlns:cx6="http://schemas.microsoft.com/office/drawing/2016/5/12/chartex" xmlns:cx7="http://schemas.microsoft.com/office/drawing/2016/5/13/chartex" xmlns:cx8="http://schemas.microsoft.com/office/drawing/2016/5/14/chartex" xmlns:mc="http://schemas.openxmlformats.org/markup-compatibility/2006" xmlns:aink="http://schemas.microsoft.com/office/drawing/2016/ink" xmlns:am3d="http://schemas.microsoft.com/office/drawing/2017/model3d" xmlns:o="urn:schemas-microsoft-com:office:office" xmlns:oel="http://schemas.microsoft.com/office/2019/extlst" xmlns:r="http://schemas.openxmlformats.org/officeDocument/2006/relationships" xmlns:m="http://schemas.openxmlformats.org/officeDocument/2006/math" xmlns:v="urn:schemas-microsoft-com:vml" xmlns:wp14="http://schemas.microsoft.com/office/word/2010/wordprocessingDrawing" xmlns:wp="http://schemas.openxmlformats.org/drawingml/2006/wordprocessingDrawing" xmlns:w10="urn:schemas-microsoft-com:office:word" xmlns:w="http://schemas.openxmlformats.org/wordprocessingml/2006/main" xmlns:w14="http://schemas.microsoft.com/office/word/2010/wordml" xmlns:w15="http://schemas.microsoft.com/office/word/2012/wordml" xmlns:w16cex="http://schemas.microsoft.com/office/word/2018/wordml/cex" xmlns:w16cid="http://schemas.microsoft.com/office/word/2016/wordml/cid" xmlns:w16="http://schemas.microsoft.com/office/word/2018/wordml" xmlns:w16du="http://schemas.microsoft.com/office/word/2023/wordml/word16du" xmlns:w16sdtdh="http://schemas.microsoft.com/office/word/2020/wordml/sdtdatahash" xmlns:w16sdtfl="http://schemas.microsoft.com/office/word/2024/wordml/sdtformatlock" xmlns:w16se="http://schemas.microsoft.com/office/word/2015/wordml/symex" xmlns:wpg="http://schemas.microsoft.com/office/word/2010/wordprocessingGroup" xmlns:wpi="http://schemas.microsoft.com/office/word/2010/wordprocessingInk" xmlns:wne="http://schemas.microsoft.com/office/word/2006/wordml" xmlns:wps="http://schemas.microsoft.com/office/word/2010/wordprocessingShape" mc:Ignorable="w14 w15 w16se w16cid w16 w16cex w16sdtdh w16sdtfl w16du wp14">
+  <w:tbl>
+    <w:tblPr>
+      <w:tblW w:w="5000" w:type="pct"/>
+      <w:jc w:val="center"/>
+      <w:tblCellMar>
+        <w:top w:w="144" w:type="dxa"/>
+        <w:left w:w="115" w:type="dxa"/>
+        <w:bottom w:w="144" w:type="dxa"/>
+        <w:right w:w="115" w:type="dxa"/>
+      </w:tblCellMar>
+      <w:tblLook w:val="04A0" w:firstRow="1" w:lastRow="0" w:firstColumn="1" w:lastColumn="0" w:noHBand="0" w:noVBand="1"/>
+    </w:tblPr>
+    <w:tblGrid>
+      <w:gridCol w:w="7011"/>
+      <w:gridCol w:w="6993"/>
+    </w:tblGrid>
+    <w:tr>
+      <w:trPr>
+        <w:trHeight w:hRule="exact" w:val="115"/>
+        <w:jc w:val="center"/>
+      </w:trPr>
+      <w:tc>
+        <w:tcPr>
+          <w:tcW w:w="4686" w:type="dxa"/>
+          <w:shd w:val="clear" w:color="auto" w:fill="156082" w:themeFill="accent1"/>
+          <w:tcMar>
+            <w:top w:w="0" w:type="dxa"/>
+            <w:bottom w:w="0" w:type="dxa"/>
+          </w:tcMar>
+        </w:tcPr>
+        <w:p>
+          <w:pPr>
+            <w:pStyle w:val="Encabezado"/>
+            <w:rPr>
+              <w:caps/>
+              <w:sz w:val="18"/>
+            </w:rPr>
+          </w:pPr>
+        </w:p>
+      </w:tc>
+      <w:tc>
+        <w:tcPr>
+          <w:tcW w:w="4674" w:type="dxa"/>
+          <w:shd w:val="clear" w:color="auto" w:fill="156082" w:themeFill="accent1"/>
+          <w:tcMar>
+            <w:top w:w="0" w:type="dxa"/>
+            <w:bottom w:w="0" w:type="dxa"/>
+          </w:tcMar>
+        </w:tcPr>
+        <w:p>
+          <w:pPr>
+            <w:pStyle w:val="Encabezado"/>
+            <w:jc w:val="right"/>
+            <w:rPr>
+              <w:caps/>
+              <w:sz w:val="18"/>
+            </w:rPr>
+          </w:pPr>
+        </w:p>
+      </w:tc>
+    </w:tr>
+    <w:tr>
+      <w:trPr>
+        <w:jc w:val="center"/>
+      </w:trPr>
+      <w:tc>
+        <w:tcPr>
+          <w:tcW w:w="4686" w:type="dxa"/>
+          <w:vAlign w:val="center"/>
+        </w:tcPr>
+        <w:p>
+          <w:pPr>
+            <w:pStyle w:val="Piedepgina"/>
+            <w:rPr>
+              <w:caps/>
+              <w:color w:val="808080" w:themeColor="background1" w:themeShade="80"/>
+              <w:sz w:val="18"/>
+              <w:szCs w:val="18"/>
+            </w:rPr>
+          </w:pPr>
+        </w:p>
+      </w:tc>
+      <w:tc>
+        <w:tcPr>
+          <w:tcW w:w="4674" w:type="dxa"/>
+          <w:vAlign w:val="center"/>
+        </w:tcPr>
+        <w:p>
+          <w:pPr>
+            <w:pStyle w:val="Piedepgina"/>
+            <w:jc w:val="right"/>
+            <w:rPr>
+              <w:caps/>
+              <w:color w:val="808080" w:themeColor="background1" w:themeShade="80"/>
+              <w:sz w:val="18"/>
+              <w:szCs w:val="18"/>
+            </w:rPr>
+          </w:pPr>
+          <w:r>
+            <w:rPr>
+              <w:sz w:val="18"/>
+              <w:szCs w:val="18"/>
+            </w:rPr>
+            <w:t xml:space="preserve">Página </w:t>
+          </w:r>
+          <w:r>
+            <w:rPr>
+              <w:sz w:val="18"/>
+              <w:szCs w:val="18"/>
+            </w:rPr>
+            <w:fldChar w:fldCharType="begin"/>
+          </w:r>
+          <w:r>
+            <w:rPr>
+              <w:sz w:val="18"/>
+              <w:szCs w:val="18"/>
+            </w:rPr>
+            <w:instrText xml:space="preserve"> PAGE   \* MERGEFORMAT </w:instrText>
+          </w:r>
+          <w:r>
+            <w:rPr>
+              <w:sz w:val="18"/>
+              <w:szCs w:val="18"/>
+            </w:rPr>
+            <w:fldChar w:fldCharType="separate"/>
+          </w:r>
+          <w:r>
+            <w:rPr>
+              <w:sz w:val="18"/>
+              <w:szCs w:val="18"/>
+            </w:rPr>
+            <w:t>1</w:t>
+          </w:r>
+          <w:r>
+            <w:rPr>
+              <w:noProof/>
+              <w:sz w:val="18"/>
+              <w:szCs w:val="18"/>
+            </w:rPr>
+            <w:fldChar w:fldCharType="end"/>
+          </w:r>
+          <w:r>
+            <w:rPr>
+              <w:sz w:val="18"/>
+              <w:szCs w:val="18"/>
+            </w:rPr>
+            <w:t xml:space="preserve"> de </w:t>
+          </w:r>
+          <w:r>
+            <w:rPr>
+              <w:sz w:val="18"/>
+              <w:szCs w:val="18"/>
+            </w:rPr>
+            <w:fldChar w:fldCharType="begin"/>
+          </w:r>
+          <w:r>
+            <w:rPr>
+              <w:sz w:val="18"/>
+              <w:szCs w:val="18"/>
+            </w:rPr>
+            <w:instrText xml:space="preserve"> NUMPAGES   \* MERGEFORMAT </w:instrText>
+          </w:r>
+          <w:r>
+            <w:rPr>
+              <w:sz w:val="18"/>
+              <w:szCs w:val="18"/>
+            </w:rPr>
+            <w:fldChar w:fldCharType="separate"/>
+          </w:r>
+          <w:r>
+            <w:rPr>
+              <w:sz w:val="18"/>
+              <w:szCs w:val="18"/>
+            </w:rPr>
+            <w:t>1</w:t>
+          </w:r>
+          <w:r>
+            <w:rPr>
+              <w:noProof/>
+              <w:sz w:val="18"/>
+              <w:szCs w:val="18"/>
+            </w:rPr>
+            <w:fldChar w:fldCharType="end"/>
+          </w:r>
+        </w:p>
+      </w:tc>
+    </w:tr>
+  </w:tbl>
   <w:p>
     <w:pPr>
       <w:pStyle w:val="Piedepgina"/>
-      <w:pBdr>
-        <w:top w:val="single" w:sz="4" w:space="1" w:color="auto"/>
-      </w:pBdr>
-      <w:tabs>
-        <w:tab w:val="clear" w:pos="4419"/>
-        <w:tab w:val="clear" w:pos="8838"/>
-        <w:tab w:val="right" w:pos="10800"/>
-      </w:tabs>
-      <w:spacing w:afterAutospacing="0"/>
-    </w:pPr>
-    <w:r>
-      <w:tab/>
-    </w:r>
-    <w:r>
-      <w:tab/>
-    </w:r>
-    <w:r>
-      <w:tab/>
-    </w:r>
-    <w:r>
-      <w:tab/>
-    </w:r>
-    <w:r>
-      <w:t xml:space="preserve">Página </w:t>
-    </w:r>
-    <w:r>
-      <w:fldChar w:fldCharType="begin"/>
-    </w:r>
-    <w:r>
-      <w:instrText xml:space="preserve"> PAGE   \* MERGEFORMAT </w:instrText>
-    </w:r>
-    <w:r>
-      <w:fldChar w:fldCharType="separate"/>
-    </w:r>
-    <w:r>
-      <w:rPr>
-        <w:noProof/>
-      </w:rPr>
-      <w:t>1</w:t>
-    </w:r>
-    <w:r>
-      <w:rPr>
-        <w:noProof/>
-      </w:rPr>
-      <w:fldChar w:fldCharType="end"/>
-    </w:r>
-    <w:r>
-      <w:t xml:space="preserve"> de </w:t>
-    </w:r>
-    <w:fldSimple w:instr=" NUMPAGES   \* MERGEFORMAT ">
-      <w:r>
-        <w:rPr>
-          <w:noProof/>
-        </w:rPr>
-        <w:t>1</w:t>
-      </w:r>
-    </w:fldSimple>
-  </w:p>
-  <w:p>
-    <w:pPr>
-      <w:pStyle w:val="Piedepgina"/>
-      <w:shd w:val="clear" w:color="auto" w:fill="17365D" w:themeFill="text2" w:themeFillShade="BF"/>
-      <w:tabs>
-        <w:tab w:val="clear" w:pos="4419"/>
-        <w:tab w:val="clear" w:pos="8838"/>
-        <w:tab w:val="center" w:pos="5400"/>
-        <w:tab w:val="right" w:pos="10800"/>
-      </w:tabs>
-      <w:spacing w:afterAutospacing="0"/>
-      <w:jc w:val="right"/>
-      <w:rPr>
-        <w:rFonts w:ascii="Copperplate Gothic Bold" w:hAnsi="Copperplate Gothic Bold"/>
-      </w:rPr>
     </w:pPr>
   </w:p>
 </w:ftr>
@@ -490,25 +597,190 @@
   <w:p>
     <w:pPr>
       <w:pStyle w:val="Encabezado"/>
-      <w:pBdr>
-        <w:bottom w:val="single" w:sz="4" w:space="1" w:color="auto"/>
-      </w:pBdr>
-      <w:spacing w:afterAutospacing="0"/>
-      <w:jc w:val="center"/>
-      <w:rPr>
-        <w:b/>
-        <w:sz w:val="36"/>
-      </w:rPr>
     </w:pPr>
     <w:r>
       <w:rPr>
-        <w:b/>
-        <w:sz w:val="36"/>
+        <w:noProof/>
       </w:rPr>
-      <w:t>EDT</w:t>
+      <mc:AlternateContent>
+        <mc:Choice Requires="wps">
+          <w:drawing>
+            <wp:anchor distT="0" distB="0" distL="118745" distR="118745" simplePos="0" relativeHeight="251658240" behindDoc="1" locked="0" layoutInCell="1" allowOverlap="0" wp14:anchorId="505419E7" wp14:editId="457299CB">
+              <wp:simplePos x="0" y="0"/>
+              <wp:positionH relativeFrom="margin">
+                <wp:align>center</wp:align>
+              </wp:positionH>
+              <mc:AlternateContent>
+                <mc:Choice Requires="wp14">
+                  <wp:positionV relativeFrom="page">
+                    <wp14:pctPosVOffset>4500</wp14:pctPosVOffset>
+                  </wp:positionV>
+                </mc:Choice>
+                <mc:Fallback>
+                  <wp:positionV relativeFrom="page">
+                    <wp:posOffset>339725</wp:posOffset>
+                  </wp:positionV>
+                </mc:Fallback>
+              </mc:AlternateContent>
+              <wp:extent cx="5950039" cy="270457"/>
+              <wp:effectExtent l="0" t="0" r="0" b="7620"/>
+              <wp:wrapSquare wrapText="bothSides"/>
+              <wp:docPr id="197" name="Rectángulo 200"/>
+              <wp:cNvGraphicFramePr/>
+              <a:graphic xmlns:a="http://schemas.openxmlformats.org/drawingml/2006/main">
+                <a:graphicData uri="http://schemas.microsoft.com/office/word/2010/wordprocessingShape">
+                  <wps:wsp>
+                    <wps:cNvSpPr/>
+                    <wps:spPr>
+                      <a:xfrm>
+                        <a:off x="0" y="0"/>
+                        <a:ext cx="5950039" cy="270457"/>
+                      </a:xfrm>
+                      <a:prstGeom prst="rect">
+                        <a:avLst/>
+                      </a:prstGeom>
+                      <a:solidFill>
+                        <a:schemeClr val="accent1"/>
+                      </a:solidFill>
+                      <a:ln>
+                        <a:noFill/>
+                      </a:ln>
+                    </wps:spPr>
+                    <wps:style>
+                      <a:lnRef idx="2">
+                        <a:schemeClr val="accent1">
+                          <a:shade val="50000"/>
+                        </a:schemeClr>
+                      </a:lnRef>
+                      <a:fillRef idx="1">
+                        <a:schemeClr val="accent1"/>
+                      </a:fillRef>
+                      <a:effectRef idx="0">
+                        <a:schemeClr val="accent1"/>
+                      </a:effectRef>
+                      <a:fontRef idx="minor">
+                        <a:schemeClr val="lt1"/>
+                      </a:fontRef>
+                    </wps:style>
+                    <wps:txbx>
+                      <w:txbxContent>
+                        <w:sdt>
+                          <w:sdtPr>
+                            <w:rPr>
+                              <w:b/>
+                              <w:kern w:val="0"/>
+                              <w14:ligatures w14:val="none"/>
+                            </w:rPr>
+                            <w:alias w:val="Título"/>
+                            <w:tag w:val=""/>
+                            <w:id w:val="1189017394"/>
+                            <w:dataBinding w:prefixMappings="xmlns:ns0='http://purl.org/dc/elements/1.1/' xmlns:ns1='http://schemas.openxmlformats.org/package/2006/metadata/core-properties' " w:xpath="/ns1:coreProperties[1]/ns0:title[1]" w:storeItemID="{6C3C8BC8-F283-45AE-878A-BAB7291924A1}"/>
+                            <w:text/>
+                          </w:sdtPr>
+                          <w:sdtEndPr/>
+                          <w:sdtContent>
+                            <w:p>
+                              <w:pPr>
+                                <w:pStyle w:val="Encabezado"/>
+                                <w:jc w:val="center"/>
+                                <w:rPr>
+                                  <w:caps/>
+                                  <w:color w:val="FFFFFF" w:themeColor="background1"/>
+                                </w:rPr>
+                              </w:pPr>
+                              <w:r>
+                                <w:rPr>
+                                  <w:b/>
+                                  <w:kern w:val="0"/>
+                                  <w14:ligatures w14:val="none"/>
+                                </w:rPr>
+                                <w:t>EDT</w:t>
+                              </w:r>
+                            </w:p>
+                          </w:sdtContent>
+                        </w:sdt>
+                      </w:txbxContent>
+                    </wps:txbx>
+                    <wps:bodyPr rot="0" spcFirstLastPara="0" vertOverflow="overflow" horzOverflow="overflow" vert="horz" wrap="square" lIns="91440" tIns="45720" rIns="91440" bIns="45720" numCol="1" spcCol="0" rtlCol="0" fromWordArt="0" anchor="ctr" anchorCtr="0" forceAA="0" compatLnSpc="1">
+                      <a:prstTxWarp prst="textNoShape">
+                        <a:avLst/>
+                      </a:prstTxWarp>
+                      <a:spAutoFit/>
+                    </wps:bodyPr>
+                  </wps:wsp>
+                </a:graphicData>
+              </a:graphic>
+              <wp14:sizeRelH relativeFrom="margin">
+                <wp14:pctWidth>100000</wp14:pctWidth>
+              </wp14:sizeRelH>
+              <wp14:sizeRelV relativeFrom="page">
+                <wp14:pctHeight>2700</wp14:pctHeight>
+              </wp14:sizeRelV>
+            </wp:anchor>
+          </w:drawing>
+        </mc:Choice>
+        <mc:Fallback>
+          <w:pict>
+            <v:rect w14:anchorId="505419E7" id="Rectángulo 200" o:spid="_x0000_s1026" style="position:absolute;margin-left:0;margin-top:0;width:468.5pt;height:21.3pt;z-index:-251658240;visibility:visible;mso-wrap-style:square;mso-width-percent:1000;mso-height-percent:27;mso-top-percent:45;mso-wrap-distance-left:9.35pt;mso-wrap-distance-top:0;mso-wrap-distance-right:9.35pt;mso-wrap-distance-bottom:0;mso-position-horizontal:center;mso-position-horizontal-relative:margin;mso-position-vertical-relative:page;mso-width-percent:1000;mso-height-percent:27;mso-top-percent:45;mso-width-relative:margin;mso-height-relative:page;v-text-anchor:middle" o:gfxdata="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" o:allowoverlap="f" fillcolor="#156082 [3204]" stroked="f" strokeweight="1.5pt">
+              <v:textbox style="mso-fit-shape-to-text:t">
+                <w:txbxContent>
+                  <w:sdt>
+                    <w:sdtPr>
+                      <w:rPr>
+                        <w:b/>
+                        <w:kern w:val="0"/>
+                        <w14:ligatures w14:val="none"/>
+                      </w:rPr>
+                      <w:alias w:val="Título"/>
+                      <w:tag w:val=""/>
+                      <w:id w:val="1189017394"/>
+                      <w:dataBinding w:prefixMappings="xmlns:ns0='http://purl.org/dc/elements/1.1/' xmlns:ns1='http://schemas.openxmlformats.org/package/2006/metadata/core-properties' " w:xpath="/ns1:coreProperties[1]/ns0:title[1]" w:storeItemID="{6C3C8BC8-F283-45AE-878A-BAB7291924A1}"/>
+                      <w:text/>
+                    </w:sdtPr>
+                    <w:sdtEndPr/>
+                    <w:sdtContent>
+                      <w:p>
+                        <w:pPr>
+                          <w:pStyle w:val="Encabezado"/>
+                          <w:jc w:val="center"/>
+                          <w:rPr>
+                            <w:caps/>
+                            <w:color w:val="FFFFFF" w:themeColor="background1"/>
+                          </w:rPr>
+                        </w:pPr>
+                        <w:r>
+                          <w:rPr>
+                            <w:b/>
+                            <w:kern w:val="0"/>
+                            <w14:ligatures w14:val="none"/>
+                          </w:rPr>
+                          <w:t>EDT</w:t>
+                        </w:r>
+                      </w:p>
+                    </w:sdtContent>
+                  </w:sdt>
+                </w:txbxContent>
+              </v:textbox>
+              <w10:wrap type="square" anchorx="margin" anchory="page"/>
+            </v:rect>
+          </w:pict>
+        </mc:Fallback>
+      </mc:AlternateContent>
     </w:r>
   </w:p>
 </w:hdr>
+</file>
+
+<file path=word/intelligence2.xml><?xml version="1.0" encoding="utf-8"?>
+<int2:intelligence xmlns:int2="http://schemas.microsoft.com/office/intelligence/2020/intelligence" xmlns:oel="http://schemas.microsoft.com/office/2019/extlst">
+  <int2:observations/>
+  <int2:intelligenceSettings/>
+  <int2:onDemandWorkflows/>
+</int2:intelligence>
+</file>
+
+<file path=word/numbering.xml><?xml version="1.0" encoding="utf-8"?>
+<w:numbering xmlns:wpc="http://schemas.microsoft.com/office/word/2010/wordprocessingCanvas" xmlns:cx="http://schemas.microsoft.com/office/drawing/2014/chartex" xmlns:cx1="http://schemas.microsoft.com/office/drawing/2015/9/8/chartex" xmlns:cx2="http://schemas.microsoft.com/office/drawing/2015/10/21/chartex" xmlns:cx3="http://schemas.microsoft.com/office/drawing/2016/5/9/chartex" xmlns:cx4="http://schemas.microsoft.com/office/drawing/2016/5/10/chartex" xmlns:cx5="http://schemas.microsoft.com/office/drawing/2016/5/11/chartex" xmlns:cx6="http://schemas.microsoft.com/office/drawing/2016/5/12/chartex" xmlns:cx7="http://schemas.microsoft.com/office/drawing/2016/5/13/chartex" xmlns:cx8="http://schemas.microsoft.com/office/drawing/2016/5/14/chartex" xmlns:mc="http://schemas.openxmlformats.org/markup-compatibility/2006" xmlns:aink="http://schemas.microsoft.com/office/drawing/2016/ink" xmlns:am3d="http://schemas.microsoft.com/office/drawing/2017/model3d" xmlns:o="urn:schemas-microsoft-com:office:office" xmlns:oel="http://schemas.microsoft.com/office/2019/extlst" xmlns:r="http://schemas.openxmlformats.org/officeDocument/2006/relationships" xmlns:m="http://schemas.openxmlformats.org/officeDocument/2006/math" xmlns:v="urn:schemas-microsoft-com:vml" xmlns:wp14="http://schemas.microsoft.com/office/word/2010/wordprocessingDrawing" xmlns:wp="http://schemas.openxmlformats.org/drawingml/2006/wordprocessingDrawing" xmlns:w10="urn:schemas-microsoft-com:office:word" xmlns:w="http://schemas.openxmlformats.org/wordprocessingml/2006/main" xmlns:w14="http://schemas.microsoft.com/office/word/2010/wordml" xmlns:w15="http://schemas.microsoft.com/office/word/2012/wordml" xmlns:w16cex="http://schemas.microsoft.com/office/word/2018/wordml/cex" xmlns:w16cid="http://schemas.microsoft.com/office/word/2016/wordml/cid" xmlns:w16="http://schemas.microsoft.com/office/word/2018/wordml" xmlns:w16du="http://schemas.microsoft.com/office/word/2023/wordml/word16du" xmlns:w16sdtdh="http://schemas.microsoft.com/office/word/2020/wordml/sdtdatahash" xmlns:w16sdtfl="http://schemas.microsoft.com/office/word/2024/wordml/sdtformatlock" xmlns:w16se="http://schemas.microsoft.com/office/word/2015/wordml/symex" xmlns:wpg="http://schemas.microsoft.com/office/word/2010/wordprocessingGroup" xmlns:wpi="http://schemas.microsoft.com/office/word/2010/wordprocessingInk" xmlns:wne="http://schemas.microsoft.com/office/word/2006/wordml" xmlns:wps="http://schemas.microsoft.com/office/word/2010/wordprocessingShape" mc:Ignorable="w14 w15 w16se w16cid w16 w16cex w16sdtdh w16sdtfl w16du wp14"/>
 </file>
 
 <file path=word/styles.xml><?xml version="1.0" encoding="utf-8"?>
@@ -517,14 +789,16 @@
     <w:rPrDefault>
       <w:rPr>
         <w:rFonts w:asciiTheme="minorHAnsi" w:eastAsiaTheme="minorHAnsi" w:hAnsiTheme="minorHAnsi" w:cstheme="minorBidi"/>
-        <w:sz w:val="22"/>
-        <w:szCs w:val="22"/>
-        <w:lang w:val="es-PA" w:eastAsia="en-US" w:bidi="ar-SA"/>
+        <w:kern w:val="2"/>
+        <w:sz w:val="24"/>
+        <w:szCs w:val="24"/>
+        <w:lang w:val="es-ES" w:eastAsia="en-US" w:bidi="ar-SA"/>
+        <w14:ligatures w14:val="standardContextual"/>
       </w:rPr>
     </w:rPrDefault>
     <w:pPrDefault>
       <w:pPr>
-        <w:spacing w:after="100" w:afterAutospacing="1" w:line="276" w:lineRule="auto"/>
+        <w:spacing w:after="160" w:line="278" w:lineRule="auto"/>
       </w:pPr>
     </w:pPrDefault>
   </w:docDefaults>
@@ -909,12 +1183,224 @@
   <w:style w:type="paragraph" w:default="1" w:styleId="Normal">
     <w:name w:val="Normal"/>
     <w:qFormat/>
-    <w:rsid w:val="00FA7A18"/>
+    <w:rsid w:val="5E9105EB"/>
     <w:pPr>
-      <w:spacing w:after="200" w:afterAutospacing="0"/>
+      <w:spacing w:after="200"/>
     </w:pPr>
     <w:rPr>
-      <w:lang w:val="en-CA"/>
+      <w:sz w:val="22"/>
+      <w:szCs w:val="22"/>
+    </w:rPr>
+  </w:style>
+  <w:style w:type="paragraph" w:styleId="Ttulo1">
+    <w:name w:val="heading 1"/>
+    <w:basedOn w:val="Normal"/>
+    <w:next w:val="Normal"/>
+    <w:link w:val="Ttulo1Car"/>
+    <w:uiPriority w:val="9"/>
+    <w:qFormat/>
+    <w:rsid w:val="5E9105EB"/>
+    <w:pPr>
+      <w:keepNext/>
+      <w:keepLines/>
+      <w:spacing w:before="360" w:after="80"/>
+      <w:outlineLvl w:val="0"/>
+    </w:pPr>
+    <w:rPr>
+      <w:rFonts w:asciiTheme="majorHAnsi" w:eastAsiaTheme="majorEastAsia" w:hAnsiTheme="majorHAnsi" w:cstheme="majorBidi"/>
+      <w:color w:val="0F4761" w:themeColor="accent1" w:themeShade="BF"/>
+      <w:sz w:val="40"/>
+      <w:szCs w:val="40"/>
+    </w:rPr>
+  </w:style>
+  <w:style w:type="paragraph" w:styleId="Ttulo2">
+    <w:name w:val="heading 2"/>
+    <w:basedOn w:val="Normal"/>
+    <w:next w:val="Normal"/>
+    <w:link w:val="Ttulo2Car"/>
+    <w:uiPriority w:val="9"/>
+    <w:semiHidden/>
+    <w:unhideWhenUsed/>
+    <w:qFormat/>
+    <w:rsid w:val="5E9105EB"/>
+    <w:pPr>
+      <w:keepNext/>
+      <w:keepLines/>
+      <w:spacing w:before="160" w:after="80"/>
+      <w:outlineLvl w:val="1"/>
+    </w:pPr>
+    <w:rPr>
+      <w:rFonts w:asciiTheme="majorHAnsi" w:eastAsiaTheme="majorEastAsia" w:hAnsiTheme="majorHAnsi" w:cstheme="majorBidi"/>
+      <w:color w:val="0F4761" w:themeColor="accent1" w:themeShade="BF"/>
+      <w:sz w:val="32"/>
+      <w:szCs w:val="32"/>
+    </w:rPr>
+  </w:style>
+  <w:style w:type="paragraph" w:styleId="Ttulo3">
+    <w:name w:val="heading 3"/>
+    <w:basedOn w:val="Normal"/>
+    <w:next w:val="Normal"/>
+    <w:link w:val="Ttulo3Car"/>
+    <w:uiPriority w:val="9"/>
+    <w:semiHidden/>
+    <w:unhideWhenUsed/>
+    <w:qFormat/>
+    <w:rsid w:val="5E9105EB"/>
+    <w:pPr>
+      <w:keepNext/>
+      <w:keepLines/>
+      <w:spacing w:before="160" w:after="80"/>
+      <w:outlineLvl w:val="2"/>
+    </w:pPr>
+    <w:rPr>
+      <w:rFonts w:eastAsiaTheme="majorEastAsia" w:cstheme="majorBidi"/>
+      <w:color w:val="0F4761" w:themeColor="accent1" w:themeShade="BF"/>
+      <w:sz w:val="28"/>
+      <w:szCs w:val="28"/>
+    </w:rPr>
+  </w:style>
+  <w:style w:type="paragraph" w:styleId="Ttulo4">
+    <w:name w:val="heading 4"/>
+    <w:basedOn w:val="Normal"/>
+    <w:next w:val="Normal"/>
+    <w:link w:val="Ttulo4Car"/>
+    <w:uiPriority w:val="9"/>
+    <w:semiHidden/>
+    <w:unhideWhenUsed/>
+    <w:qFormat/>
+    <w:rsid w:val="5E9105EB"/>
+    <w:pPr>
+      <w:keepNext/>
+      <w:keepLines/>
+      <w:spacing w:before="80" w:after="40"/>
+      <w:outlineLvl w:val="3"/>
+    </w:pPr>
+    <w:rPr>
+      <w:rFonts w:eastAsiaTheme="majorEastAsia" w:cstheme="majorBidi"/>
+      <w:i/>
+      <w:iCs/>
+      <w:color w:val="0F4761" w:themeColor="accent1" w:themeShade="BF"/>
+      <w:sz w:val="24"/>
+      <w:szCs w:val="24"/>
+    </w:rPr>
+  </w:style>
+  <w:style w:type="paragraph" w:styleId="Ttulo5">
+    <w:name w:val="heading 5"/>
+    <w:basedOn w:val="Normal"/>
+    <w:next w:val="Normal"/>
+    <w:link w:val="Ttulo5Car"/>
+    <w:uiPriority w:val="9"/>
+    <w:semiHidden/>
+    <w:unhideWhenUsed/>
+    <w:qFormat/>
+    <w:rsid w:val="5E9105EB"/>
+    <w:pPr>
+      <w:keepNext/>
+      <w:keepLines/>
+      <w:spacing w:before="80" w:after="40"/>
+      <w:outlineLvl w:val="4"/>
+    </w:pPr>
+    <w:rPr>
+      <w:rFonts w:eastAsiaTheme="majorEastAsia" w:cstheme="majorBidi"/>
+      <w:color w:val="0F4761" w:themeColor="accent1" w:themeShade="BF"/>
+      <w:sz w:val="24"/>
+      <w:szCs w:val="24"/>
+    </w:rPr>
+  </w:style>
+  <w:style w:type="paragraph" w:styleId="Ttulo6">
+    <w:name w:val="heading 6"/>
+    <w:basedOn w:val="Normal"/>
+    <w:next w:val="Normal"/>
+    <w:link w:val="Ttulo6Car"/>
+    <w:uiPriority w:val="9"/>
+    <w:semiHidden/>
+    <w:unhideWhenUsed/>
+    <w:qFormat/>
+    <w:rsid w:val="5E9105EB"/>
+    <w:pPr>
+      <w:keepNext/>
+      <w:keepLines/>
+      <w:spacing w:before="40" w:after="0"/>
+      <w:outlineLvl w:val="5"/>
+    </w:pPr>
+    <w:rPr>
+      <w:rFonts w:eastAsiaTheme="majorEastAsia" w:cstheme="majorBidi"/>
+      <w:i/>
+      <w:iCs/>
+      <w:color w:val="595959" w:themeColor="text1" w:themeTint="A6"/>
+      <w:sz w:val="24"/>
+      <w:szCs w:val="24"/>
+    </w:rPr>
+  </w:style>
+  <w:style w:type="paragraph" w:styleId="Ttulo7">
+    <w:name w:val="heading 7"/>
+    <w:basedOn w:val="Normal"/>
+    <w:next w:val="Normal"/>
+    <w:link w:val="Ttulo7Car"/>
+    <w:uiPriority w:val="9"/>
+    <w:semiHidden/>
+    <w:unhideWhenUsed/>
+    <w:qFormat/>
+    <w:rsid w:val="5E9105EB"/>
+    <w:pPr>
+      <w:keepNext/>
+      <w:keepLines/>
+      <w:spacing w:before="40" w:after="0"/>
+      <w:outlineLvl w:val="6"/>
+    </w:pPr>
+    <w:rPr>
+      <w:rFonts w:eastAsiaTheme="majorEastAsia" w:cstheme="majorBidi"/>
+      <w:color w:val="595959" w:themeColor="text1" w:themeTint="A6"/>
+      <w:sz w:val="24"/>
+      <w:szCs w:val="24"/>
+    </w:rPr>
+  </w:style>
+  <w:style w:type="paragraph" w:styleId="Ttulo8">
+    <w:name w:val="heading 8"/>
+    <w:basedOn w:val="Normal"/>
+    <w:next w:val="Normal"/>
+    <w:link w:val="Ttulo8Car"/>
+    <w:uiPriority w:val="9"/>
+    <w:semiHidden/>
+    <w:unhideWhenUsed/>
+    <w:qFormat/>
+    <w:rsid w:val="5E9105EB"/>
+    <w:pPr>
+      <w:keepNext/>
+      <w:keepLines/>
+      <w:spacing w:after="0"/>
+      <w:outlineLvl w:val="7"/>
+    </w:pPr>
+    <w:rPr>
+      <w:rFonts w:eastAsiaTheme="majorEastAsia" w:cstheme="majorBidi"/>
+      <w:i/>
+      <w:iCs/>
+      <w:color w:val="272727"/>
+      <w:sz w:val="24"/>
+      <w:szCs w:val="24"/>
+    </w:rPr>
+  </w:style>
+  <w:style w:type="paragraph" w:styleId="Ttulo9">
+    <w:name w:val="heading 9"/>
+    <w:basedOn w:val="Normal"/>
+    <w:next w:val="Normal"/>
+    <w:link w:val="Ttulo9Car"/>
+    <w:uiPriority w:val="9"/>
+    <w:semiHidden/>
+    <w:unhideWhenUsed/>
+    <w:qFormat/>
+    <w:rsid w:val="5E9105EB"/>
+    <w:pPr>
+      <w:keepNext/>
+      <w:keepLines/>
+      <w:spacing w:after="0"/>
+      <w:outlineLvl w:val="8"/>
+    </w:pPr>
+    <w:rPr>
+      <w:rFonts w:eastAsiaTheme="majorEastAsia" w:cstheme="majorBidi"/>
+      <w:color w:val="272727"/>
+      <w:sz w:val="24"/>
+      <w:szCs w:val="24"/>
     </w:rPr>
   </w:style>
   <w:style w:type="character" w:default="1" w:styleId="Fuentedeprrafopredeter">
@@ -944,22 +1430,314 @@
     <w:semiHidden/>
     <w:unhideWhenUsed/>
   </w:style>
+  <w:style w:type="character" w:customStyle="1" w:styleId="Ttulo1Car">
+    <w:name w:val="Título 1 Car"/>
+    <w:basedOn w:val="Fuentedeprrafopredeter"/>
+    <w:link w:val="Ttulo1"/>
+    <w:uiPriority w:val="9"/>
+    <w:rsid w:val="00B330E8"/>
+    <w:rPr>
+      <w:rFonts w:asciiTheme="majorHAnsi" w:eastAsiaTheme="majorEastAsia" w:hAnsiTheme="majorHAnsi" w:cstheme="majorBidi"/>
+      <w:color w:val="0F4761" w:themeColor="accent1" w:themeShade="BF"/>
+      <w:sz w:val="40"/>
+      <w:szCs w:val="40"/>
+    </w:rPr>
+  </w:style>
+  <w:style w:type="character" w:customStyle="1" w:styleId="Ttulo2Car">
+    <w:name w:val="Título 2 Car"/>
+    <w:basedOn w:val="Fuentedeprrafopredeter"/>
+    <w:link w:val="Ttulo2"/>
+    <w:uiPriority w:val="9"/>
+    <w:semiHidden/>
+    <w:rsid w:val="00B330E8"/>
+    <w:rPr>
+      <w:rFonts w:asciiTheme="majorHAnsi" w:eastAsiaTheme="majorEastAsia" w:hAnsiTheme="majorHAnsi" w:cstheme="majorBidi"/>
+      <w:color w:val="0F4761" w:themeColor="accent1" w:themeShade="BF"/>
+      <w:sz w:val="32"/>
+      <w:szCs w:val="32"/>
+    </w:rPr>
+  </w:style>
+  <w:style w:type="character" w:customStyle="1" w:styleId="Ttulo3Car">
+    <w:name w:val="Título 3 Car"/>
+    <w:basedOn w:val="Fuentedeprrafopredeter"/>
+    <w:link w:val="Ttulo3"/>
+    <w:uiPriority w:val="9"/>
+    <w:semiHidden/>
+    <w:rsid w:val="00B330E8"/>
+    <w:rPr>
+      <w:rFonts w:eastAsiaTheme="majorEastAsia" w:cstheme="majorBidi"/>
+      <w:color w:val="0F4761" w:themeColor="accent1" w:themeShade="BF"/>
+      <w:sz w:val="28"/>
+      <w:szCs w:val="28"/>
+    </w:rPr>
+  </w:style>
+  <w:style w:type="character" w:customStyle="1" w:styleId="Ttulo4Car">
+    <w:name w:val="Título 4 Car"/>
+    <w:basedOn w:val="Fuentedeprrafopredeter"/>
+    <w:link w:val="Ttulo4"/>
+    <w:uiPriority w:val="9"/>
+    <w:semiHidden/>
+    <w:rsid w:val="00B330E8"/>
+    <w:rPr>
+      <w:rFonts w:eastAsiaTheme="majorEastAsia" w:cstheme="majorBidi"/>
+      <w:i/>
+      <w:iCs/>
+      <w:color w:val="0F4761" w:themeColor="accent1" w:themeShade="BF"/>
+    </w:rPr>
+  </w:style>
+  <w:style w:type="character" w:customStyle="1" w:styleId="Ttulo5Car">
+    <w:name w:val="Título 5 Car"/>
+    <w:basedOn w:val="Fuentedeprrafopredeter"/>
+    <w:link w:val="Ttulo5"/>
+    <w:uiPriority w:val="9"/>
+    <w:semiHidden/>
+    <w:rsid w:val="00B330E8"/>
+    <w:rPr>
+      <w:rFonts w:eastAsiaTheme="majorEastAsia" w:cstheme="majorBidi"/>
+      <w:color w:val="0F4761" w:themeColor="accent1" w:themeShade="BF"/>
+    </w:rPr>
+  </w:style>
+  <w:style w:type="character" w:customStyle="1" w:styleId="Ttulo6Car">
+    <w:name w:val="Título 6 Car"/>
+    <w:basedOn w:val="Fuentedeprrafopredeter"/>
+    <w:link w:val="Ttulo6"/>
+    <w:uiPriority w:val="9"/>
+    <w:semiHidden/>
+    <w:rsid w:val="00B330E8"/>
+    <w:rPr>
+      <w:rFonts w:eastAsiaTheme="majorEastAsia" w:cstheme="majorBidi"/>
+      <w:i/>
+      <w:iCs/>
+      <w:color w:val="595959" w:themeColor="text1" w:themeTint="A6"/>
+    </w:rPr>
+  </w:style>
+  <w:style w:type="character" w:customStyle="1" w:styleId="Ttulo7Car">
+    <w:name w:val="Título 7 Car"/>
+    <w:basedOn w:val="Fuentedeprrafopredeter"/>
+    <w:link w:val="Ttulo7"/>
+    <w:uiPriority w:val="9"/>
+    <w:semiHidden/>
+    <w:rsid w:val="00B330E8"/>
+    <w:rPr>
+      <w:rFonts w:eastAsiaTheme="majorEastAsia" w:cstheme="majorBidi"/>
+      <w:color w:val="595959" w:themeColor="text1" w:themeTint="A6"/>
+    </w:rPr>
+  </w:style>
+  <w:style w:type="character" w:customStyle="1" w:styleId="Ttulo8Car">
+    <w:name w:val="Título 8 Car"/>
+    <w:basedOn w:val="Fuentedeprrafopredeter"/>
+    <w:link w:val="Ttulo8"/>
+    <w:uiPriority w:val="9"/>
+    <w:semiHidden/>
+    <w:rsid w:val="00B330E8"/>
+    <w:rPr>
+      <w:rFonts w:eastAsiaTheme="majorEastAsia" w:cstheme="majorBidi"/>
+      <w:i/>
+      <w:iCs/>
+      <w:color w:val="272727"/>
+    </w:rPr>
+  </w:style>
+  <w:style w:type="character" w:customStyle="1" w:styleId="Ttulo9Car">
+    <w:name w:val="Título 9 Car"/>
+    <w:basedOn w:val="Fuentedeprrafopredeter"/>
+    <w:link w:val="Ttulo9"/>
+    <w:uiPriority w:val="9"/>
+    <w:semiHidden/>
+    <w:rsid w:val="00B330E8"/>
+    <w:rPr>
+      <w:rFonts w:eastAsiaTheme="majorEastAsia" w:cstheme="majorBidi"/>
+      <w:color w:val="272727"/>
+    </w:rPr>
+  </w:style>
+  <w:style w:type="paragraph" w:styleId="Ttulo">
+    <w:name w:val="Title"/>
+    <w:basedOn w:val="Normal"/>
+    <w:next w:val="Normal"/>
+    <w:link w:val="TtuloCar"/>
+    <w:uiPriority w:val="10"/>
+    <w:qFormat/>
+    <w:rsid w:val="5E9105EB"/>
+    <w:pPr>
+      <w:spacing w:after="80"/>
+      <w:contextualSpacing/>
+    </w:pPr>
+    <w:rPr>
+      <w:rFonts w:asciiTheme="majorHAnsi" w:eastAsiaTheme="majorEastAsia" w:hAnsiTheme="majorHAnsi" w:cstheme="majorBidi"/>
+      <w:sz w:val="56"/>
+      <w:szCs w:val="56"/>
+    </w:rPr>
+  </w:style>
+  <w:style w:type="character" w:customStyle="1" w:styleId="TtuloCar">
+    <w:name w:val="Título Car"/>
+    <w:basedOn w:val="Fuentedeprrafopredeter"/>
+    <w:link w:val="Ttulo"/>
+    <w:uiPriority w:val="10"/>
+    <w:rsid w:val="00B330E8"/>
+    <w:rPr>
+      <w:rFonts w:asciiTheme="majorHAnsi" w:eastAsiaTheme="majorEastAsia" w:hAnsiTheme="majorHAnsi" w:cstheme="majorBidi"/>
+      <w:sz w:val="56"/>
+      <w:szCs w:val="56"/>
+    </w:rPr>
+  </w:style>
+  <w:style w:type="paragraph" w:styleId="Subttulo">
+    <w:name w:val="Subtitle"/>
+    <w:basedOn w:val="Normal"/>
+    <w:next w:val="Normal"/>
+    <w:link w:val="SubttuloCar"/>
+    <w:uiPriority w:val="11"/>
+    <w:qFormat/>
+    <w:rsid w:val="5E9105EB"/>
+    <w:pPr>
+      <w:spacing w:after="160"/>
+    </w:pPr>
+    <w:rPr>
+      <w:rFonts w:eastAsiaTheme="majorEastAsia" w:cstheme="majorBidi"/>
+      <w:color w:val="595959" w:themeColor="text1" w:themeTint="A6"/>
+      <w:sz w:val="28"/>
+      <w:szCs w:val="28"/>
+    </w:rPr>
+  </w:style>
+  <w:style w:type="character" w:customStyle="1" w:styleId="SubttuloCar">
+    <w:name w:val="Subtítulo Car"/>
+    <w:basedOn w:val="Fuentedeprrafopredeter"/>
+    <w:link w:val="Subttulo"/>
+    <w:uiPriority w:val="11"/>
+    <w:rsid w:val="00B330E8"/>
+    <w:rPr>
+      <w:rFonts w:eastAsiaTheme="majorEastAsia" w:cstheme="majorBidi"/>
+      <w:color w:val="595959" w:themeColor="text1" w:themeTint="A6"/>
+      <w:sz w:val="28"/>
+      <w:szCs w:val="28"/>
+    </w:rPr>
+  </w:style>
+  <w:style w:type="paragraph" w:styleId="Cita">
+    <w:name w:val="Quote"/>
+    <w:basedOn w:val="Normal"/>
+    <w:next w:val="Normal"/>
+    <w:link w:val="CitaCar"/>
+    <w:uiPriority w:val="29"/>
+    <w:qFormat/>
+    <w:rsid w:val="5E9105EB"/>
+    <w:pPr>
+      <w:spacing w:before="160" w:after="160"/>
+      <w:jc w:val="center"/>
+    </w:pPr>
+    <w:rPr>
+      <w:i/>
+      <w:iCs/>
+      <w:color w:val="404040" w:themeColor="text1" w:themeTint="BF"/>
+      <w:sz w:val="24"/>
+      <w:szCs w:val="24"/>
+    </w:rPr>
+  </w:style>
+  <w:style w:type="character" w:customStyle="1" w:styleId="CitaCar">
+    <w:name w:val="Cita Car"/>
+    <w:basedOn w:val="Fuentedeprrafopredeter"/>
+    <w:link w:val="Cita"/>
+    <w:uiPriority w:val="29"/>
+    <w:rsid w:val="00B330E8"/>
+    <w:rPr>
+      <w:i/>
+      <w:iCs/>
+      <w:color w:val="404040" w:themeColor="text1" w:themeTint="BF"/>
+    </w:rPr>
+  </w:style>
+  <w:style w:type="paragraph" w:styleId="Prrafodelista">
+    <w:name w:val="List Paragraph"/>
+    <w:basedOn w:val="Normal"/>
+    <w:uiPriority w:val="34"/>
+    <w:qFormat/>
+    <w:rsid w:val="5E9105EB"/>
+    <w:pPr>
+      <w:spacing w:after="160"/>
+      <w:ind w:left="720"/>
+      <w:contextualSpacing/>
+    </w:pPr>
+    <w:rPr>
+      <w:sz w:val="24"/>
+      <w:szCs w:val="24"/>
+    </w:rPr>
+  </w:style>
+  <w:style w:type="character" w:styleId="nfasisintenso">
+    <w:name w:val="Intense Emphasis"/>
+    <w:basedOn w:val="Fuentedeprrafopredeter"/>
+    <w:uiPriority w:val="21"/>
+    <w:qFormat/>
+    <w:rsid w:val="00B330E8"/>
+    <w:rPr>
+      <w:i/>
+      <w:iCs/>
+      <w:color w:val="0F4761" w:themeColor="accent1" w:themeShade="BF"/>
+    </w:rPr>
+  </w:style>
+  <w:style w:type="paragraph" w:styleId="Citadestacada">
+    <w:name w:val="Intense Quote"/>
+    <w:basedOn w:val="Normal"/>
+    <w:next w:val="Normal"/>
+    <w:link w:val="CitadestacadaCar"/>
+    <w:uiPriority w:val="30"/>
+    <w:qFormat/>
+    <w:rsid w:val="5E9105EB"/>
+    <w:pPr>
+      <w:pBdr>
+        <w:top w:val="single" w:sz="4" w:space="10" w:color="0F4761" w:themeColor="accent1" w:themeShade="BF"/>
+        <w:bottom w:val="single" w:sz="4" w:space="10" w:color="0F4761" w:themeColor="accent1" w:themeShade="BF"/>
+      </w:pBdr>
+      <w:spacing w:before="360" w:after="360"/>
+      <w:ind w:left="864" w:right="864"/>
+      <w:jc w:val="center"/>
+    </w:pPr>
+    <w:rPr>
+      <w:i/>
+      <w:iCs/>
+      <w:color w:val="0F4761" w:themeColor="accent1" w:themeShade="BF"/>
+      <w:sz w:val="24"/>
+      <w:szCs w:val="24"/>
+    </w:rPr>
+  </w:style>
+  <w:style w:type="character" w:customStyle="1" w:styleId="CitadestacadaCar">
+    <w:name w:val="Cita destacada Car"/>
+    <w:basedOn w:val="Fuentedeprrafopredeter"/>
+    <w:link w:val="Citadestacada"/>
+    <w:uiPriority w:val="30"/>
+    <w:rsid w:val="00B330E8"/>
+    <w:rPr>
+      <w:i/>
+      <w:iCs/>
+      <w:color w:val="0F4761" w:themeColor="accent1" w:themeShade="BF"/>
+    </w:rPr>
+  </w:style>
+  <w:style w:type="character" w:styleId="Referenciaintensa">
+    <w:name w:val="Intense Reference"/>
+    <w:basedOn w:val="Fuentedeprrafopredeter"/>
+    <w:uiPriority w:val="32"/>
+    <w:qFormat/>
+    <w:rsid w:val="00B330E8"/>
+    <w:rPr>
+      <w:b/>
+      <w:bCs/>
+      <w:smallCaps/>
+      <w:color w:val="0F4761" w:themeColor="accent1" w:themeShade="BF"/>
+      <w:spacing w:val="5"/>
+    </w:rPr>
+  </w:style>
   <w:style w:type="paragraph" w:styleId="Encabezado">
     <w:name w:val="header"/>
     <w:basedOn w:val="Normal"/>
     <w:link w:val="EncabezadoCar"/>
     <w:uiPriority w:val="99"/>
     <w:unhideWhenUsed/>
-    <w:rsid w:val="00837F2F"/>
+    <w:rsid w:val="5E9105EB"/>
     <w:pPr>
       <w:tabs>
-        <w:tab w:val="center" w:pos="4419"/>
-        <w:tab w:val="right" w:pos="8838"/>
+        <w:tab w:val="center" w:pos="4252"/>
+        <w:tab w:val="right" w:pos="8504"/>
       </w:tabs>
-      <w:spacing w:after="0" w:afterAutospacing="1" w:line="240" w:lineRule="auto"/>
+      <w:spacing w:after="0"/>
     </w:pPr>
     <w:rPr>
-      <w:lang w:val="es-PA"/>
+      <w:sz w:val="24"/>
+      <w:szCs w:val="24"/>
     </w:rPr>
   </w:style>
   <w:style w:type="character" w:customStyle="1" w:styleId="EncabezadoCar">
@@ -967,7 +1745,7 @@
     <w:basedOn w:val="Fuentedeprrafopredeter"/>
     <w:link w:val="Encabezado"/>
     <w:uiPriority w:val="99"/>
-    <w:rsid w:val="00837F2F"/>
+    <w:rsid w:val="00B330E8"/>
   </w:style>
   <w:style w:type="paragraph" w:styleId="Piedepgina">
     <w:name w:val="footer"/>
@@ -975,16 +1753,17 @@
     <w:link w:val="PiedepginaCar"/>
     <w:uiPriority w:val="99"/>
     <w:unhideWhenUsed/>
-    <w:rsid w:val="00837F2F"/>
+    <w:rsid w:val="5E9105EB"/>
     <w:pPr>
       <w:tabs>
-        <w:tab w:val="center" w:pos="4419"/>
-        <w:tab w:val="right" w:pos="8838"/>
+        <w:tab w:val="center" w:pos="4252"/>
+        <w:tab w:val="right" w:pos="8504"/>
       </w:tabs>
-      <w:spacing w:after="0" w:afterAutospacing="1" w:line="240" w:lineRule="auto"/>
+      <w:spacing w:after="0"/>
     </w:pPr>
     <w:rPr>
-      <w:lang w:val="es-PA"/>
+      <w:sz w:val="24"/>
+      <w:szCs w:val="24"/>
     </w:rPr>
   </w:style>
   <w:style w:type="character" w:customStyle="1" w:styleId="PiedepginaCar">
@@ -992,46 +1771,23 @@
     <w:basedOn w:val="Fuentedeprrafopredeter"/>
     <w:link w:val="Piedepgina"/>
     <w:uiPriority w:val="99"/>
-    <w:rsid w:val="00837F2F"/>
-  </w:style>
-  <w:style w:type="paragraph" w:styleId="Textodeglobo">
-    <w:name w:val="Balloon Text"/>
-    <w:basedOn w:val="Normal"/>
-    <w:link w:val="TextodegloboCar"/>
-    <w:uiPriority w:val="99"/>
-    <w:semiHidden/>
-    <w:unhideWhenUsed/>
-    <w:rsid w:val="00837F2F"/>
-    <w:pPr>
-      <w:spacing w:after="0" w:line="240" w:lineRule="auto"/>
-    </w:pPr>
-    <w:rPr>
-      <w:rFonts w:ascii="Tahoma" w:hAnsi="Tahoma" w:cs="Tahoma"/>
-      <w:sz w:val="16"/>
-      <w:szCs w:val="16"/>
-    </w:rPr>
-  </w:style>
-  <w:style w:type="character" w:customStyle="1" w:styleId="TextodegloboCar">
-    <w:name w:val="Texto de globo Car"/>
-    <w:basedOn w:val="Fuentedeprrafopredeter"/>
-    <w:link w:val="Textodeglobo"/>
-    <w:uiPriority w:val="99"/>
-    <w:semiHidden/>
-    <w:rsid w:val="00837F2F"/>
-    <w:rPr>
-      <w:rFonts w:ascii="Tahoma" w:hAnsi="Tahoma" w:cs="Tahoma"/>
-      <w:sz w:val="16"/>
-      <w:szCs w:val="16"/>
-    </w:rPr>
+    <w:rsid w:val="00B330E8"/>
   </w:style>
   <w:style w:type="table" w:styleId="Tablaconcuadrcula">
     <w:name w:val="Table Grid"/>
     <w:basedOn w:val="Tablanormal"/>
     <w:uiPriority w:val="59"/>
-    <w:rsid w:val="000512B0"/>
+    <w:rsid w:val="00B330E8"/>
     <w:pPr>
-      <w:spacing w:after="0" w:line="240" w:lineRule="auto"/>
+      <w:spacing w:after="0" w:afterAutospacing="1" w:line="240" w:lineRule="auto"/>
     </w:pPr>
+    <w:rPr>
+      <w:kern w:val="0"/>
+      <w:sz w:val="22"/>
+      <w:szCs w:val="22"/>
+      <w:lang w:val="es-PA"/>
+      <w14:ligatures w14:val="none"/>
+    </w:rPr>
     <w:tblPr>
       <w:tblBorders>
         <w:top w:val="single" w:sz="4" w:space="0" w:color="auto"/>
@@ -1042,17 +1798,6 @@
         <w:insideV w:val="single" w:sz="4" w:space="0" w:color="auto"/>
       </w:tblBorders>
     </w:tblPr>
-  </w:style>
-  <w:style w:type="character" w:styleId="Hipervnculo">
-    <w:name w:val="Hyperlink"/>
-    <w:basedOn w:val="Fuentedeprrafopredeter"/>
-    <w:uiPriority w:val="99"/>
-    <w:unhideWhenUsed/>
-    <w:rsid w:val="006D54FD"/>
-    <w:rPr>
-      <w:color w:val="0000FF" w:themeColor="hyperlink"/>
-      <w:u w:val="single"/>
-    </w:rPr>
   </w:style>
 </w:styles>
 </file>
@@ -1068,44 +1813,44 @@
         <a:sysClr val="window" lastClr="FFFFFF"/>
       </a:lt1>
       <a:dk2>
-        <a:srgbClr val="1F497D"/>
+        <a:srgbClr val="0E2841"/>
       </a:dk2>
       <a:lt2>
-        <a:srgbClr val="EEECE1"/>
+        <a:srgbClr val="E8E8E8"/>
       </a:lt2>
       <a:accent1>
-        <a:srgbClr val="4F81BD"/>
+        <a:srgbClr val="156082"/>
       </a:accent1>
       <a:accent2>
-        <a:srgbClr val="C0504D"/>
+        <a:srgbClr val="E97132"/>
       </a:accent2>
       <a:accent3>
-        <a:srgbClr val="9BBB59"/>
+        <a:srgbClr val="196B24"/>
       </a:accent3>
       <a:accent4>
-        <a:srgbClr val="8064A2"/>
+        <a:srgbClr val="0F9ED5"/>
       </a:accent4>
       <a:accent5>
-        <a:srgbClr val="4BACC6"/>
+        <a:srgbClr val="A02B93"/>
       </a:accent5>
       <a:accent6>
-        <a:srgbClr val="F79646"/>
+        <a:srgbClr val="4EA72E"/>
       </a:accent6>
       <a:hlink>
-        <a:srgbClr val="0000FF"/>
+        <a:srgbClr val="467886"/>
       </a:hlink>
       <a:folHlink>
-        <a:srgbClr val="800080"/>
+        <a:srgbClr val="96607D"/>
       </a:folHlink>
     </a:clrScheme>
     <a:fontScheme name="Office">
       <a:majorFont>
-        <a:latin typeface="Cambria"/>
+        <a:latin typeface="Aptos Display" panose="02110004020202020204"/>
         <a:ea typeface=""/>
         <a:cs typeface=""/>
-        <a:font script="Jpan" typeface="ＭＳ ゴシック"/>
+        <a:font script="Jpan" typeface="游ゴシック Light"/>
         <a:font script="Hang" typeface="맑은 고딕"/>
-        <a:font script="Hans" typeface="宋体"/>
+        <a:font script="Hans" typeface="等线 Light"/>
         <a:font script="Hant" typeface="新細明體"/>
         <a:font script="Arab" typeface="Times New Roman"/>
         <a:font script="Hebr" typeface="Times New Roman"/>
@@ -1132,14 +1877,32 @@
         <a:font script="Mong" typeface="Mongolian Baiti"/>
         <a:font script="Viet" typeface="Times New Roman"/>
         <a:font script="Uigh" typeface="Microsoft Uighur"/>
+        <a:font script="Geor" typeface="Sylfaen"/>
+        <a:font script="Armn" typeface="Arial"/>
+        <a:font script="Bugi" typeface="Leelawadee UI"/>
+        <a:font script="Bopo" typeface="Microsoft JhengHei"/>
+        <a:font script="Java" typeface="Javanese Text"/>
+        <a:font script="Lisu" typeface="Segoe UI"/>
+        <a:font script="Mymr" typeface="Myanmar Text"/>
+        <a:font script="Nkoo" typeface="Ebrima"/>
+        <a:font script="Olck" typeface="Nirmala UI"/>
+        <a:font script="Osma" typeface="Ebrima"/>
+        <a:font script="Phag" typeface="Phagspa"/>
+        <a:font script="Syrn" typeface="Estrangelo Edessa"/>
+        <a:font script="Syrj" typeface="Estrangelo Edessa"/>
+        <a:font script="Syre" typeface="Estrangelo Edessa"/>
+        <a:font script="Sora" typeface="Nirmala UI"/>
+        <a:font script="Tale" typeface="Microsoft Tai Le"/>
+        <a:font script="Talu" typeface="Microsoft New Tai Lue"/>
+        <a:font script="Tfng" typeface="Ebrima"/>
       </a:majorFont>
       <a:minorFont>
-        <a:latin typeface="Calibri"/>
+        <a:latin typeface="Aptos" panose="02110004020202020204"/>
         <a:ea typeface=""/>
         <a:cs typeface=""/>
-        <a:font script="Jpan" typeface="ＭＳ 明朝"/>
+        <a:font script="Jpan" typeface="游明朝"/>
         <a:font script="Hang" typeface="맑은 고딕"/>
-        <a:font script="Hans" typeface="宋体"/>
+        <a:font script="Hans" typeface="等线"/>
         <a:font script="Hant" typeface="新細明體"/>
         <a:font script="Arab" typeface="Arial"/>
         <a:font script="Hebr" typeface="Arial"/>
@@ -1166,6 +1929,24 @@
         <a:font script="Mong" typeface="Mongolian Baiti"/>
         <a:font script="Viet" typeface="Arial"/>
         <a:font script="Uigh" typeface="Microsoft Uighur"/>
+        <a:font script="Geor" typeface="Sylfaen"/>
+        <a:font script="Armn" typeface="Arial"/>
+        <a:font script="Bugi" typeface="Leelawadee UI"/>
+        <a:font script="Bopo" typeface="Microsoft JhengHei"/>
+        <a:font script="Java" typeface="Javanese Text"/>
+        <a:font script="Lisu" typeface="Segoe UI"/>
+        <a:font script="Mymr" typeface="Myanmar Text"/>
+        <a:font script="Nkoo" typeface="Ebrima"/>
+        <a:font script="Olck" typeface="Nirmala UI"/>
+        <a:font script="Osma" typeface="Ebrima"/>
+        <a:font script="Phag" typeface="Phagspa"/>
+        <a:font script="Syrn" typeface="Estrangelo Edessa"/>
+        <a:font script="Syrj" typeface="Estrangelo Edessa"/>
+        <a:font script="Syre" typeface="Estrangelo Edessa"/>
+        <a:font script="Sora" typeface="Nirmala UI"/>
+        <a:font script="Tale" typeface="Microsoft Tai Le"/>
+        <a:font script="Talu" typeface="Microsoft New Tai Lue"/>
+        <a:font script="Tfng" typeface="Ebrima"/>
       </a:minorFont>
     </a:fontScheme>
     <a:fmtScheme name="Office">
@@ -1177,165 +1958,161 @@
           <a:gsLst>
             <a:gs pos="0">
               <a:schemeClr val="phClr">
-                <a:tint val="50000"/>
-                <a:satMod val="300000"/>
+                <a:lumMod val="110000"/>
+                <a:satMod val="105000"/>
+                <a:tint val="67000"/>
               </a:schemeClr>
             </a:gs>
-            <a:gs pos="35000">
+            <a:gs pos="50000">
               <a:schemeClr val="phClr">
-                <a:tint val="37000"/>
-                <a:satMod val="300000"/>
+                <a:lumMod val="105000"/>
+                <a:satMod val="103000"/>
+                <a:tint val="73000"/>
               </a:schemeClr>
             </a:gs>
             <a:gs pos="100000">
               <a:schemeClr val="phClr">
-                <a:tint val="15000"/>
-                <a:satMod val="350000"/>
+                <a:lumMod val="105000"/>
+                <a:satMod val="109000"/>
+                <a:tint val="81000"/>
               </a:schemeClr>
             </a:gs>
           </a:gsLst>
-          <a:lin ang="16200000" scaled="1"/>
+          <a:lin ang="5400000" scaled="0"/>
         </a:gradFill>
         <a:gradFill rotWithShape="1">
           <a:gsLst>
             <a:gs pos="0">
               <a:schemeClr val="phClr">
-                <a:shade val="51000"/>
-                <a:satMod val="130000"/>
+                <a:satMod val="103000"/>
+                <a:lumMod val="102000"/>
+                <a:tint val="94000"/>
               </a:schemeClr>
             </a:gs>
-            <a:gs pos="80000">
+            <a:gs pos="50000">
               <a:schemeClr val="phClr">
-                <a:shade val="93000"/>
-                <a:satMod val="130000"/>
+                <a:satMod val="110000"/>
+                <a:lumMod val="100000"/>
+                <a:shade val="100000"/>
               </a:schemeClr>
             </a:gs>
             <a:gs pos="100000">
               <a:schemeClr val="phClr">
-                <a:shade val="94000"/>
-                <a:satMod val="135000"/>
+                <a:lumMod val="99000"/>
+                <a:satMod val="120000"/>
+                <a:shade val="78000"/>
               </a:schemeClr>
             </a:gs>
           </a:gsLst>
-          <a:lin ang="16200000" scaled="0"/>
+          <a:lin ang="5400000" scaled="0"/>
         </a:gradFill>
       </a:fillStyleLst>
       <a:lnStyleLst>
-        <a:ln w="9525" cap="flat" cmpd="sng" algn="ctr">
+        <a:ln w="12700" cap="flat" cmpd="sng" algn="ctr">
           <a:solidFill>
-            <a:schemeClr val="phClr">
-              <a:shade val="95000"/>
-              <a:satMod val="105000"/>
-            </a:schemeClr>
+            <a:schemeClr val="phClr"/>
           </a:solidFill>
           <a:prstDash val="solid"/>
+          <a:miter lim="800000"/>
+        </a:ln>
+        <a:ln w="19050" cap="flat" cmpd="sng" algn="ctr">
+          <a:solidFill>
+            <a:schemeClr val="phClr"/>
+          </a:solidFill>
+          <a:prstDash val="solid"/>
+          <a:miter lim="800000"/>
         </a:ln>
         <a:ln w="25400" cap="flat" cmpd="sng" algn="ctr">
           <a:solidFill>
             <a:schemeClr val="phClr"/>
           </a:solidFill>
           <a:prstDash val="solid"/>
-        </a:ln>
-        <a:ln w="38100" cap="flat" cmpd="sng" algn="ctr">
-          <a:solidFill>
-            <a:schemeClr val="phClr"/>
-          </a:solidFill>
-          <a:prstDash val="solid"/>
+          <a:miter lim="800000"/>
         </a:ln>
       </a:lnStyleLst>
       <a:effectStyleLst>
         <a:effectStyle>
+          <a:effectLst/>
+        </a:effectStyle>
+        <a:effectStyle>
+          <a:effectLst/>
+        </a:effectStyle>
+        <a:effectStyle>
           <a:effectLst>
-            <a:outerShdw blurRad="40000" dist="20000" dir="5400000" rotWithShape="0">
+            <a:outerShdw blurRad="57150" dist="19050" dir="5400000" algn="ctr" rotWithShape="0">
               <a:srgbClr val="000000">
-                <a:alpha val="38000"/>
+                <a:alpha val="63000"/>
               </a:srgbClr>
             </a:outerShdw>
           </a:effectLst>
-        </a:effectStyle>
-        <a:effectStyle>
-          <a:effectLst>
-            <a:outerShdw blurRad="40000" dist="23000" dir="5400000" rotWithShape="0">
-              <a:srgbClr val="000000">
-                <a:alpha val="35000"/>
-              </a:srgbClr>
-            </a:outerShdw>
-          </a:effectLst>
-        </a:effectStyle>
-        <a:effectStyle>
-          <a:effectLst>
-            <a:outerShdw blurRad="40000" dist="23000" dir="5400000" rotWithShape="0">
-              <a:srgbClr val="000000">
-                <a:alpha val="35000"/>
-              </a:srgbClr>
-            </a:outerShdw>
-          </a:effectLst>
-          <a:scene3d>
-            <a:camera prst="orthographicFront">
-              <a:rot lat="0" lon="0" rev="0"/>
-            </a:camera>
-            <a:lightRig rig="threePt" dir="t">
-              <a:rot lat="0" lon="0" rev="1200000"/>
-            </a:lightRig>
-          </a:scene3d>
-          <a:sp3d>
-            <a:bevelT w="63500" h="25400"/>
-          </a:sp3d>
         </a:effectStyle>
       </a:effectStyleLst>
       <a:bgFillStyleLst>
         <a:solidFill>
           <a:schemeClr val="phClr"/>
         </a:solidFill>
+        <a:solidFill>
+          <a:schemeClr val="phClr">
+            <a:tint val="95000"/>
+            <a:satMod val="170000"/>
+          </a:schemeClr>
+        </a:solidFill>
         <a:gradFill rotWithShape="1">
           <a:gsLst>
             <a:gs pos="0">
               <a:schemeClr val="phClr">
-                <a:tint val="40000"/>
-                <a:satMod val="350000"/>
+                <a:tint val="93000"/>
+                <a:satMod val="150000"/>
+                <a:shade val="98000"/>
+                <a:lumMod val="102000"/>
               </a:schemeClr>
             </a:gs>
-            <a:gs pos="40000">
+            <a:gs pos="50000">
               <a:schemeClr val="phClr">
-                <a:tint val="45000"/>
-                <a:shade val="99000"/>
-                <a:satMod val="350000"/>
+                <a:tint val="98000"/>
+                <a:satMod val="130000"/>
+                <a:shade val="90000"/>
+                <a:lumMod val="103000"/>
               </a:schemeClr>
             </a:gs>
             <a:gs pos="100000">
               <a:schemeClr val="phClr">
-                <a:shade val="20000"/>
-                <a:satMod val="255000"/>
+                <a:shade val="63000"/>
+                <a:satMod val="120000"/>
               </a:schemeClr>
             </a:gs>
           </a:gsLst>
-          <a:path path="circle">
-            <a:fillToRect l="50000" t="-80000" r="50000" b="180000"/>
-          </a:path>
-        </a:gradFill>
-        <a:gradFill rotWithShape="1">
-          <a:gsLst>
-            <a:gs pos="0">
-              <a:schemeClr val="phClr">
-                <a:tint val="80000"/>
-                <a:satMod val="300000"/>
-              </a:schemeClr>
-            </a:gs>
-            <a:gs pos="100000">
-              <a:schemeClr val="phClr">
-                <a:shade val="30000"/>
-                <a:satMod val="200000"/>
-              </a:schemeClr>
-            </a:gs>
-          </a:gsLst>
-          <a:path path="circle">
-            <a:fillToRect l="50000" t="50000" r="50000" b="50000"/>
-          </a:path>
+          <a:lin ang="5400000" scaled="0"/>
         </a:gradFill>
       </a:bgFillStyleLst>
     </a:fmtScheme>
   </a:themeElements>
-  <a:objectDefaults/>
+  <a:objectDefaults>
+    <a:lnDef>
+      <a:spPr/>
+      <a:bodyPr/>
+      <a:lstStyle/>
+      <a:style>
+        <a:lnRef idx="2">
+          <a:schemeClr val="accent1"/>
+        </a:lnRef>
+        <a:fillRef idx="0">
+          <a:schemeClr val="accent1"/>
+        </a:fillRef>
+        <a:effectRef idx="1">
+          <a:schemeClr val="accent1"/>
+        </a:effectRef>
+        <a:fontRef idx="minor">
+          <a:schemeClr val="tx1"/>
+        </a:fontRef>
+      </a:style>
+    </a:lnDef>
+  </a:objectDefaults>
   <a:extraClrSchemeLst/>
+  <a:extLst>
+    <a:ext uri="{05A4C25C-085E-4340-85A3-A5531E510DB2}">
+      <thm15:themeFamily xmlns:thm15="http://schemas.microsoft.com/office/thememl/2012/main" name="Office Theme" id="{2E142A2C-CD16-42D6-873A-C26D2A0506FA}" vid="{1BDDFF52-6CD6-40A5-AB3C-68EB2F1E4D0A}"/>
+    </a:ext>
+  </a:extLst>
 </a:theme>
 </file>
</xml_diff>

<commit_message>
docs: corrección de los documents tras la revisión del tutor
</commit_message>
<xml_diff>
--- a/Documentacion/Planificacion/Lineas Base/EDT.docx
+++ b/Documentacion/Planificacion/Lineas Base/EDT.docx
@@ -4,7 +4,7 @@
   <w:body>
     <w:tbl>
       <w:tblPr>
-        <w:tblStyle w:val="Tablaconcuadrcula"/>
+        <w:tblStyle w:val="TableGrid"/>
         <w:tblW w:w="0" w:type="auto"/>
         <w:tblLook w:val="04A0" w:firstRow="1" w:lastRow="0" w:firstColumn="1" w:lastColumn="0" w:noHBand="0" w:noVBand="1"/>
       </w:tblPr>
@@ -403,7 +403,7 @@
         </w:tcPr>
         <w:p>
           <w:pPr>
-            <w:pStyle w:val="Encabezado"/>
+            <w:pStyle w:val="Header"/>
             <w:rPr>
               <w:caps/>
               <w:sz w:val="18"/>
@@ -422,7 +422,7 @@
         </w:tcPr>
         <w:p>
           <w:pPr>
-            <w:pStyle w:val="Encabezado"/>
+            <w:pStyle w:val="Header"/>
             <w:jc w:val="right"/>
             <w:rPr>
               <w:caps/>
@@ -443,7 +443,7 @@
         </w:tcPr>
         <w:p>
           <w:pPr>
-            <w:pStyle w:val="Piedepgina"/>
+            <w:pStyle w:val="Footer"/>
             <w:rPr>
               <w:caps/>
               <w:color w:val="808080" w:themeColor="background1" w:themeShade="80"/>
@@ -460,7 +460,7 @@
         </w:tcPr>
         <w:p>
           <w:pPr>
-            <w:pStyle w:val="Piedepgina"/>
+            <w:pStyle w:val="Footer"/>
             <w:jc w:val="right"/>
             <w:rPr>
               <w:caps/>
@@ -561,7 +561,7 @@
   </w:tbl>
   <w:p>
     <w:pPr>
-      <w:pStyle w:val="Piedepgina"/>
+      <w:pStyle w:val="Footer"/>
     </w:pPr>
   </w:p>
 </w:ftr>
@@ -596,7 +596,7 @@
 <w:hdr xmlns:wpc="http://schemas.microsoft.com/office/word/2010/wordprocessingCanvas" xmlns:cx="http://schemas.microsoft.com/office/drawing/2014/chartex" xmlns:cx1="http://schemas.microsoft.com/office/drawing/2015/9/8/chartex" xmlns:cx2="http://schemas.microsoft.com/office/drawing/2015/10/21/chartex" xmlns:cx3="http://schemas.microsoft.com/office/drawing/2016/5/9/chartex" xmlns:cx4="http://schemas.microsoft.com/office/drawing/2016/5/10/chartex" xmlns:cx5="http://schemas.microsoft.com/office/drawing/2016/5/11/chartex" xmlns:cx6="http://schemas.microsoft.com/office/drawing/2016/5/12/chartex" xmlns:cx7="http://schemas.microsoft.com/office/drawing/2016/5/13/chartex" xmlns:cx8="http://schemas.microsoft.com/office/drawing/2016/5/14/chartex" xmlns:mc="http://schemas.openxmlformats.org/markup-compatibility/2006" xmlns:aink="http://schemas.microsoft.com/office/drawing/2016/ink" xmlns:am3d="http://schemas.microsoft.com/office/drawing/2017/model3d" xmlns:o="urn:schemas-microsoft-com:office:office" xmlns:oel="http://schemas.microsoft.com/office/2019/extlst" xmlns:r="http://schemas.openxmlformats.org/officeDocument/2006/relationships" xmlns:m="http://schemas.openxmlformats.org/officeDocument/2006/math" xmlns:v="urn:schemas-microsoft-com:vml" xmlns:wp14="http://schemas.microsoft.com/office/word/2010/wordprocessingDrawing" xmlns:wp="http://schemas.openxmlformats.org/drawingml/2006/wordprocessingDrawing" xmlns:w10="urn:schemas-microsoft-com:office:word" xmlns:w="http://schemas.openxmlformats.org/wordprocessingml/2006/main" xmlns:w14="http://schemas.microsoft.com/office/word/2010/wordml" xmlns:w15="http://schemas.microsoft.com/office/word/2012/wordml" xmlns:w16cex="http://schemas.microsoft.com/office/word/2018/wordml/cex" xmlns:w16cid="http://schemas.microsoft.com/office/word/2016/wordml/cid" xmlns:w16="http://schemas.microsoft.com/office/word/2018/wordml" xmlns:w16du="http://schemas.microsoft.com/office/word/2023/wordml/word16du" xmlns:w16sdtdh="http://schemas.microsoft.com/office/word/2020/wordml/sdtdatahash" xmlns:w16sdtfl="http://schemas.microsoft.com/office/word/2024/wordml/sdtformatlock" xmlns:w16se="http://schemas.microsoft.com/office/word/2015/wordml/symex" xmlns:wpg="http://schemas.microsoft.com/office/word/2010/wordprocessingGroup" xmlns:wpi="http://schemas.microsoft.com/office/word/2010/wordprocessingInk" xmlns:wne="http://schemas.microsoft.com/office/word/2006/wordml" xmlns:wps="http://schemas.microsoft.com/office/word/2010/wordprocessingShape" mc:Ignorable="w14 w15 w16se w16cid w16 w16cex w16sdtdh w16sdtfl w16du wp14">
   <w:p>
     <w:pPr>
-      <w:pStyle w:val="Encabezado"/>
+      <w:pStyle w:val="Header"/>
     </w:pPr>
     <w:r>
       <w:rPr>
@@ -677,11 +677,10 @@
                             <w:dataBinding w:prefixMappings="xmlns:ns0='http://purl.org/dc/elements/1.1/' xmlns:ns1='http://schemas.openxmlformats.org/package/2006/metadata/core-properties' " w:xpath="/ns1:coreProperties[1]/ns0:title[1]" w:storeItemID="{6C3C8BC8-F283-45AE-878A-BAB7291924A1}"/>
                             <w:text/>
                           </w:sdtPr>
-                          <w:sdtEndPr/>
                           <w:sdtContent>
                             <w:p>
                               <w:pPr>
-                                <w:pStyle w:val="Encabezado"/>
+                                <w:pStyle w:val="Header"/>
                                 <w:jc w:val="center"/>
                                 <w:rPr>
                                   <w:caps/>
@@ -719,7 +718,7 @@
             </wp:anchor>
           </w:drawing>
         </mc:Choice>
-        <mc:Fallback>
+        <mc:Fallback xmlns:arto="http://schemas.microsoft.com/office/word/2006/arto">
           <w:pict>
             <v:rect w14:anchorId="505419E7" id="Rectángulo 200" o:spid="_x0000_s1026" style="position:absolute;margin-left:0;margin-top:0;width:468.5pt;height:21.3pt;z-index:-251658240;visibility:visible;mso-wrap-style:square;mso-width-percent:1000;mso-height-percent:27;mso-top-percent:45;mso-wrap-distance-left:9.35pt;mso-wrap-distance-top:0;mso-wrap-distance-right:9.35pt;mso-wrap-distance-bottom:0;mso-position-horizontal:center;mso-position-horizontal-relative:margin;mso-position-vertical-relative:page;mso-width-percent:1000;mso-height-percent:27;mso-top-percent:45;mso-width-relative:margin;mso-height-relative:page;v-text-anchor:middle" o:gfxdata="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" o:allowoverlap="f" fillcolor="#156082 [3204]" stroked="f" strokeweight="1.5pt">
               <v:textbox style="mso-fit-shape-to-text:t">
@@ -737,7 +736,6 @@
                       <w:dataBinding w:prefixMappings="xmlns:ns0='http://purl.org/dc/elements/1.1/' xmlns:ns1='http://schemas.openxmlformats.org/package/2006/metadata/core-properties' " w:xpath="/ns1:coreProperties[1]/ns0:title[1]" w:storeItemID="{6C3C8BC8-F283-45AE-878A-BAB7291924A1}"/>
                       <w:text/>
                     </w:sdtPr>
-                    <w:sdtEndPr/>
                     <w:sdtContent>
                       <w:p>
                         <w:pPr>
@@ -1192,11 +1190,11 @@
       <w:szCs w:val="22"/>
     </w:rPr>
   </w:style>
-  <w:style w:type="paragraph" w:styleId="Ttulo1">
+  <w:style w:type="paragraph" w:styleId="Heading1">
     <w:name w:val="heading 1"/>
     <w:basedOn w:val="Normal"/>
     <w:next w:val="Normal"/>
-    <w:link w:val="Ttulo1Car"/>
+    <w:link w:val="Heading1Char"/>
     <w:uiPriority w:val="9"/>
     <w:qFormat/>
     <w:rsid w:val="5E9105EB"/>
@@ -1213,11 +1211,11 @@
       <w:szCs w:val="40"/>
     </w:rPr>
   </w:style>
-  <w:style w:type="paragraph" w:styleId="Ttulo2">
+  <w:style w:type="paragraph" w:styleId="Heading2">
     <w:name w:val="heading 2"/>
     <w:basedOn w:val="Normal"/>
     <w:next w:val="Normal"/>
-    <w:link w:val="Ttulo2Car"/>
+    <w:link w:val="Heading2Char"/>
     <w:uiPriority w:val="9"/>
     <w:semiHidden/>
     <w:unhideWhenUsed/>
@@ -1236,11 +1234,11 @@
       <w:szCs w:val="32"/>
     </w:rPr>
   </w:style>
-  <w:style w:type="paragraph" w:styleId="Ttulo3">
+  <w:style w:type="paragraph" w:styleId="Heading3">
     <w:name w:val="heading 3"/>
     <w:basedOn w:val="Normal"/>
     <w:next w:val="Normal"/>
-    <w:link w:val="Ttulo3Car"/>
+    <w:link w:val="Heading3Char"/>
     <w:uiPriority w:val="9"/>
     <w:semiHidden/>
     <w:unhideWhenUsed/>
@@ -1259,11 +1257,11 @@
       <w:szCs w:val="28"/>
     </w:rPr>
   </w:style>
-  <w:style w:type="paragraph" w:styleId="Ttulo4">
+  <w:style w:type="paragraph" w:styleId="Heading4">
     <w:name w:val="heading 4"/>
     <w:basedOn w:val="Normal"/>
     <w:next w:val="Normal"/>
-    <w:link w:val="Ttulo4Car"/>
+    <w:link w:val="Heading4Char"/>
     <w:uiPriority w:val="9"/>
     <w:semiHidden/>
     <w:unhideWhenUsed/>
@@ -1284,11 +1282,11 @@
       <w:szCs w:val="24"/>
     </w:rPr>
   </w:style>
-  <w:style w:type="paragraph" w:styleId="Ttulo5">
+  <w:style w:type="paragraph" w:styleId="Heading5">
     <w:name w:val="heading 5"/>
     <w:basedOn w:val="Normal"/>
     <w:next w:val="Normal"/>
-    <w:link w:val="Ttulo5Car"/>
+    <w:link w:val="Heading5Char"/>
     <w:uiPriority w:val="9"/>
     <w:semiHidden/>
     <w:unhideWhenUsed/>
@@ -1307,11 +1305,11 @@
       <w:szCs w:val="24"/>
     </w:rPr>
   </w:style>
-  <w:style w:type="paragraph" w:styleId="Ttulo6">
+  <w:style w:type="paragraph" w:styleId="Heading6">
     <w:name w:val="heading 6"/>
     <w:basedOn w:val="Normal"/>
     <w:next w:val="Normal"/>
-    <w:link w:val="Ttulo6Car"/>
+    <w:link w:val="Heading6Char"/>
     <w:uiPriority w:val="9"/>
     <w:semiHidden/>
     <w:unhideWhenUsed/>
@@ -1332,11 +1330,11 @@
       <w:szCs w:val="24"/>
     </w:rPr>
   </w:style>
-  <w:style w:type="paragraph" w:styleId="Ttulo7">
+  <w:style w:type="paragraph" w:styleId="Heading7">
     <w:name w:val="heading 7"/>
     <w:basedOn w:val="Normal"/>
     <w:next w:val="Normal"/>
-    <w:link w:val="Ttulo7Car"/>
+    <w:link w:val="Heading7Char"/>
     <w:uiPriority w:val="9"/>
     <w:semiHidden/>
     <w:unhideWhenUsed/>
@@ -1355,11 +1353,11 @@
       <w:szCs w:val="24"/>
     </w:rPr>
   </w:style>
-  <w:style w:type="paragraph" w:styleId="Ttulo8">
+  <w:style w:type="paragraph" w:styleId="Heading8">
     <w:name w:val="heading 8"/>
     <w:basedOn w:val="Normal"/>
     <w:next w:val="Normal"/>
-    <w:link w:val="Ttulo8Car"/>
+    <w:link w:val="Heading8Char"/>
     <w:uiPriority w:val="9"/>
     <w:semiHidden/>
     <w:unhideWhenUsed/>
@@ -1380,11 +1378,11 @@
       <w:szCs w:val="24"/>
     </w:rPr>
   </w:style>
-  <w:style w:type="paragraph" w:styleId="Ttulo9">
+  <w:style w:type="paragraph" w:styleId="Heading9">
     <w:name w:val="heading 9"/>
     <w:basedOn w:val="Normal"/>
     <w:next w:val="Normal"/>
-    <w:link w:val="Ttulo9Car"/>
+    <w:link w:val="Heading9Char"/>
     <w:uiPriority w:val="9"/>
     <w:semiHidden/>
     <w:unhideWhenUsed/>
@@ -1403,13 +1401,13 @@
       <w:szCs w:val="24"/>
     </w:rPr>
   </w:style>
-  <w:style w:type="character" w:default="1" w:styleId="Fuentedeprrafopredeter">
+  <w:style w:type="character" w:default="1" w:styleId="DefaultParagraphFont">
     <w:name w:val="Default Paragraph Font"/>
     <w:uiPriority w:val="1"/>
     <w:semiHidden/>
     <w:unhideWhenUsed/>
   </w:style>
-  <w:style w:type="table" w:default="1" w:styleId="Tablanormal">
+  <w:style w:type="table" w:default="1" w:styleId="TableNormal">
     <w:name w:val="Normal Table"/>
     <w:uiPriority w:val="99"/>
     <w:semiHidden/>
@@ -1424,16 +1422,16 @@
       </w:tblCellMar>
     </w:tblPr>
   </w:style>
-  <w:style w:type="numbering" w:default="1" w:styleId="Sinlista">
+  <w:style w:type="numbering" w:default="1" w:styleId="NoList">
     <w:name w:val="No List"/>
     <w:uiPriority w:val="99"/>
     <w:semiHidden/>
     <w:unhideWhenUsed/>
   </w:style>
-  <w:style w:type="character" w:customStyle="1" w:styleId="Ttulo1Car">
-    <w:name w:val="Título 1 Car"/>
-    <w:basedOn w:val="Fuentedeprrafopredeter"/>
-    <w:link w:val="Ttulo1"/>
+  <w:style w:type="character" w:customStyle="1" w:styleId="Heading1Char">
+    <w:name w:val="Heading 1 Char"/>
+    <w:basedOn w:val="DefaultParagraphFont"/>
+    <w:link w:val="Heading1"/>
     <w:uiPriority w:val="9"/>
     <w:rsid w:val="00B330E8"/>
     <w:rPr>
@@ -1443,10 +1441,10 @@
       <w:szCs w:val="40"/>
     </w:rPr>
   </w:style>
-  <w:style w:type="character" w:customStyle="1" w:styleId="Ttulo2Car">
-    <w:name w:val="Título 2 Car"/>
-    <w:basedOn w:val="Fuentedeprrafopredeter"/>
-    <w:link w:val="Ttulo2"/>
+  <w:style w:type="character" w:customStyle="1" w:styleId="Heading2Char">
+    <w:name w:val="Heading 2 Char"/>
+    <w:basedOn w:val="DefaultParagraphFont"/>
+    <w:link w:val="Heading2"/>
     <w:uiPriority w:val="9"/>
     <w:semiHidden/>
     <w:rsid w:val="00B330E8"/>
@@ -1457,10 +1455,10 @@
       <w:szCs w:val="32"/>
     </w:rPr>
   </w:style>
-  <w:style w:type="character" w:customStyle="1" w:styleId="Ttulo3Car">
-    <w:name w:val="Título 3 Car"/>
-    <w:basedOn w:val="Fuentedeprrafopredeter"/>
-    <w:link w:val="Ttulo3"/>
+  <w:style w:type="character" w:customStyle="1" w:styleId="Heading3Char">
+    <w:name w:val="Heading 3 Char"/>
+    <w:basedOn w:val="DefaultParagraphFont"/>
+    <w:link w:val="Heading3"/>
     <w:uiPriority w:val="9"/>
     <w:semiHidden/>
     <w:rsid w:val="00B330E8"/>
@@ -1471,10 +1469,10 @@
       <w:szCs w:val="28"/>
     </w:rPr>
   </w:style>
-  <w:style w:type="character" w:customStyle="1" w:styleId="Ttulo4Car">
-    <w:name w:val="Título 4 Car"/>
-    <w:basedOn w:val="Fuentedeprrafopredeter"/>
-    <w:link w:val="Ttulo4"/>
+  <w:style w:type="character" w:customStyle="1" w:styleId="Heading4Char">
+    <w:name w:val="Heading 4 Char"/>
+    <w:basedOn w:val="DefaultParagraphFont"/>
+    <w:link w:val="Heading4"/>
     <w:uiPriority w:val="9"/>
     <w:semiHidden/>
     <w:rsid w:val="00B330E8"/>
@@ -1485,10 +1483,10 @@
       <w:color w:val="0F4761" w:themeColor="accent1" w:themeShade="BF"/>
     </w:rPr>
   </w:style>
-  <w:style w:type="character" w:customStyle="1" w:styleId="Ttulo5Car">
-    <w:name w:val="Título 5 Car"/>
-    <w:basedOn w:val="Fuentedeprrafopredeter"/>
-    <w:link w:val="Ttulo5"/>
+  <w:style w:type="character" w:customStyle="1" w:styleId="Heading5Char">
+    <w:name w:val="Heading 5 Char"/>
+    <w:basedOn w:val="DefaultParagraphFont"/>
+    <w:link w:val="Heading5"/>
     <w:uiPriority w:val="9"/>
     <w:semiHidden/>
     <w:rsid w:val="00B330E8"/>
@@ -1497,10 +1495,10 @@
       <w:color w:val="0F4761" w:themeColor="accent1" w:themeShade="BF"/>
     </w:rPr>
   </w:style>
-  <w:style w:type="character" w:customStyle="1" w:styleId="Ttulo6Car">
-    <w:name w:val="Título 6 Car"/>
-    <w:basedOn w:val="Fuentedeprrafopredeter"/>
-    <w:link w:val="Ttulo6"/>
+  <w:style w:type="character" w:customStyle="1" w:styleId="Heading6Char">
+    <w:name w:val="Heading 6 Char"/>
+    <w:basedOn w:val="DefaultParagraphFont"/>
+    <w:link w:val="Heading6"/>
     <w:uiPriority w:val="9"/>
     <w:semiHidden/>
     <w:rsid w:val="00B330E8"/>
@@ -1511,10 +1509,10 @@
       <w:color w:val="595959" w:themeColor="text1" w:themeTint="A6"/>
     </w:rPr>
   </w:style>
-  <w:style w:type="character" w:customStyle="1" w:styleId="Ttulo7Car">
-    <w:name w:val="Título 7 Car"/>
-    <w:basedOn w:val="Fuentedeprrafopredeter"/>
-    <w:link w:val="Ttulo7"/>
+  <w:style w:type="character" w:customStyle="1" w:styleId="Heading7Char">
+    <w:name w:val="Heading 7 Char"/>
+    <w:basedOn w:val="DefaultParagraphFont"/>
+    <w:link w:val="Heading7"/>
     <w:uiPriority w:val="9"/>
     <w:semiHidden/>
     <w:rsid w:val="00B330E8"/>
@@ -1523,10 +1521,10 @@
       <w:color w:val="595959" w:themeColor="text1" w:themeTint="A6"/>
     </w:rPr>
   </w:style>
-  <w:style w:type="character" w:customStyle="1" w:styleId="Ttulo8Car">
-    <w:name w:val="Título 8 Car"/>
-    <w:basedOn w:val="Fuentedeprrafopredeter"/>
-    <w:link w:val="Ttulo8"/>
+  <w:style w:type="character" w:customStyle="1" w:styleId="Heading8Char">
+    <w:name w:val="Heading 8 Char"/>
+    <w:basedOn w:val="DefaultParagraphFont"/>
+    <w:link w:val="Heading8"/>
     <w:uiPriority w:val="9"/>
     <w:semiHidden/>
     <w:rsid w:val="00B330E8"/>
@@ -1537,10 +1535,10 @@
       <w:color w:val="272727"/>
     </w:rPr>
   </w:style>
-  <w:style w:type="character" w:customStyle="1" w:styleId="Ttulo9Car">
-    <w:name w:val="Título 9 Car"/>
-    <w:basedOn w:val="Fuentedeprrafopredeter"/>
-    <w:link w:val="Ttulo9"/>
+  <w:style w:type="character" w:customStyle="1" w:styleId="Heading9Char">
+    <w:name w:val="Heading 9 Char"/>
+    <w:basedOn w:val="DefaultParagraphFont"/>
+    <w:link w:val="Heading9"/>
     <w:uiPriority w:val="9"/>
     <w:semiHidden/>
     <w:rsid w:val="00B330E8"/>
@@ -1549,11 +1547,11 @@
       <w:color w:val="272727"/>
     </w:rPr>
   </w:style>
-  <w:style w:type="paragraph" w:styleId="Ttulo">
+  <w:style w:type="paragraph" w:styleId="Title">
     <w:name w:val="Title"/>
     <w:basedOn w:val="Normal"/>
     <w:next w:val="Normal"/>
-    <w:link w:val="TtuloCar"/>
+    <w:link w:val="TitleChar"/>
     <w:uiPriority w:val="10"/>
     <w:qFormat/>
     <w:rsid w:val="5E9105EB"/>
@@ -1567,10 +1565,10 @@
       <w:szCs w:val="56"/>
     </w:rPr>
   </w:style>
-  <w:style w:type="character" w:customStyle="1" w:styleId="TtuloCar">
-    <w:name w:val="Título Car"/>
-    <w:basedOn w:val="Fuentedeprrafopredeter"/>
-    <w:link w:val="Ttulo"/>
+  <w:style w:type="character" w:customStyle="1" w:styleId="TitleChar">
+    <w:name w:val="Title Char"/>
+    <w:basedOn w:val="DefaultParagraphFont"/>
+    <w:link w:val="Title"/>
     <w:uiPriority w:val="10"/>
     <w:rsid w:val="00B330E8"/>
     <w:rPr>
@@ -1579,11 +1577,11 @@
       <w:szCs w:val="56"/>
     </w:rPr>
   </w:style>
-  <w:style w:type="paragraph" w:styleId="Subttulo">
+  <w:style w:type="paragraph" w:styleId="Subtitle">
     <w:name w:val="Subtitle"/>
     <w:basedOn w:val="Normal"/>
     <w:next w:val="Normal"/>
-    <w:link w:val="SubttuloCar"/>
+    <w:link w:val="SubtitleChar"/>
     <w:uiPriority w:val="11"/>
     <w:qFormat/>
     <w:rsid w:val="5E9105EB"/>
@@ -1597,10 +1595,10 @@
       <w:szCs w:val="28"/>
     </w:rPr>
   </w:style>
-  <w:style w:type="character" w:customStyle="1" w:styleId="SubttuloCar">
-    <w:name w:val="Subtítulo Car"/>
-    <w:basedOn w:val="Fuentedeprrafopredeter"/>
-    <w:link w:val="Subttulo"/>
+  <w:style w:type="character" w:customStyle="1" w:styleId="SubtitleChar">
+    <w:name w:val="Subtitle Char"/>
+    <w:basedOn w:val="DefaultParagraphFont"/>
+    <w:link w:val="Subtitle"/>
     <w:uiPriority w:val="11"/>
     <w:rsid w:val="00B330E8"/>
     <w:rPr>
@@ -1610,11 +1608,11 @@
       <w:szCs w:val="28"/>
     </w:rPr>
   </w:style>
-  <w:style w:type="paragraph" w:styleId="Cita">
+  <w:style w:type="paragraph" w:styleId="Quote">
     <w:name w:val="Quote"/>
     <w:basedOn w:val="Normal"/>
     <w:next w:val="Normal"/>
-    <w:link w:val="CitaCar"/>
+    <w:link w:val="QuoteChar"/>
     <w:uiPriority w:val="29"/>
     <w:qFormat/>
     <w:rsid w:val="5E9105EB"/>
@@ -1630,10 +1628,10 @@
       <w:szCs w:val="24"/>
     </w:rPr>
   </w:style>
-  <w:style w:type="character" w:customStyle="1" w:styleId="CitaCar">
-    <w:name w:val="Cita Car"/>
-    <w:basedOn w:val="Fuentedeprrafopredeter"/>
-    <w:link w:val="Cita"/>
+  <w:style w:type="character" w:customStyle="1" w:styleId="QuoteChar">
+    <w:name w:val="Quote Char"/>
+    <w:basedOn w:val="DefaultParagraphFont"/>
+    <w:link w:val="Quote"/>
     <w:uiPriority w:val="29"/>
     <w:rsid w:val="00B330E8"/>
     <w:rPr>
@@ -1642,7 +1640,7 @@
       <w:color w:val="404040" w:themeColor="text1" w:themeTint="BF"/>
     </w:rPr>
   </w:style>
-  <w:style w:type="paragraph" w:styleId="Prrafodelista">
+  <w:style w:type="paragraph" w:styleId="ListParagraph">
     <w:name w:val="List Paragraph"/>
     <w:basedOn w:val="Normal"/>
     <w:uiPriority w:val="34"/>
@@ -1658,9 +1656,9 @@
       <w:szCs w:val="24"/>
     </w:rPr>
   </w:style>
-  <w:style w:type="character" w:styleId="nfasisintenso">
+  <w:style w:type="character" w:styleId="IntenseEmphasis">
     <w:name w:val="Intense Emphasis"/>
-    <w:basedOn w:val="Fuentedeprrafopredeter"/>
+    <w:basedOn w:val="DefaultParagraphFont"/>
     <w:uiPriority w:val="21"/>
     <w:qFormat/>
     <w:rsid w:val="00B330E8"/>
@@ -1670,11 +1668,11 @@
       <w:color w:val="0F4761" w:themeColor="accent1" w:themeShade="BF"/>
     </w:rPr>
   </w:style>
-  <w:style w:type="paragraph" w:styleId="Citadestacada">
+  <w:style w:type="paragraph" w:styleId="IntenseQuote">
     <w:name w:val="Intense Quote"/>
     <w:basedOn w:val="Normal"/>
     <w:next w:val="Normal"/>
-    <w:link w:val="CitadestacadaCar"/>
+    <w:link w:val="IntenseQuoteChar"/>
     <w:uiPriority w:val="30"/>
     <w:qFormat/>
     <w:rsid w:val="5E9105EB"/>
@@ -1695,10 +1693,10 @@
       <w:szCs w:val="24"/>
     </w:rPr>
   </w:style>
-  <w:style w:type="character" w:customStyle="1" w:styleId="CitadestacadaCar">
-    <w:name w:val="Cita destacada Car"/>
-    <w:basedOn w:val="Fuentedeprrafopredeter"/>
-    <w:link w:val="Citadestacada"/>
+  <w:style w:type="character" w:customStyle="1" w:styleId="IntenseQuoteChar">
+    <w:name w:val="Intense Quote Char"/>
+    <w:basedOn w:val="DefaultParagraphFont"/>
+    <w:link w:val="IntenseQuote"/>
     <w:uiPriority w:val="30"/>
     <w:rsid w:val="00B330E8"/>
     <w:rPr>
@@ -1707,9 +1705,9 @@
       <w:color w:val="0F4761" w:themeColor="accent1" w:themeShade="BF"/>
     </w:rPr>
   </w:style>
-  <w:style w:type="character" w:styleId="Referenciaintensa">
+  <w:style w:type="character" w:styleId="IntenseReference">
     <w:name w:val="Intense Reference"/>
-    <w:basedOn w:val="Fuentedeprrafopredeter"/>
+    <w:basedOn w:val="DefaultParagraphFont"/>
     <w:uiPriority w:val="32"/>
     <w:qFormat/>
     <w:rsid w:val="00B330E8"/>
@@ -1721,10 +1719,10 @@
       <w:spacing w:val="5"/>
     </w:rPr>
   </w:style>
-  <w:style w:type="paragraph" w:styleId="Encabezado">
+  <w:style w:type="paragraph" w:styleId="Header">
     <w:name w:val="header"/>
     <w:basedOn w:val="Normal"/>
-    <w:link w:val="EncabezadoCar"/>
+    <w:link w:val="HeaderChar"/>
     <w:uiPriority w:val="99"/>
     <w:unhideWhenUsed/>
     <w:rsid w:val="5E9105EB"/>
@@ -1740,17 +1738,17 @@
       <w:szCs w:val="24"/>
     </w:rPr>
   </w:style>
-  <w:style w:type="character" w:customStyle="1" w:styleId="EncabezadoCar">
-    <w:name w:val="Encabezado Car"/>
-    <w:basedOn w:val="Fuentedeprrafopredeter"/>
-    <w:link w:val="Encabezado"/>
+  <w:style w:type="character" w:customStyle="1" w:styleId="HeaderChar">
+    <w:name w:val="Header Char"/>
+    <w:basedOn w:val="DefaultParagraphFont"/>
+    <w:link w:val="Header"/>
     <w:uiPriority w:val="99"/>
     <w:rsid w:val="00B330E8"/>
   </w:style>
-  <w:style w:type="paragraph" w:styleId="Piedepgina">
+  <w:style w:type="paragraph" w:styleId="Footer">
     <w:name w:val="footer"/>
     <w:basedOn w:val="Normal"/>
-    <w:link w:val="PiedepginaCar"/>
+    <w:link w:val="FooterChar"/>
     <w:uiPriority w:val="99"/>
     <w:unhideWhenUsed/>
     <w:rsid w:val="5E9105EB"/>
@@ -1766,16 +1764,16 @@
       <w:szCs w:val="24"/>
     </w:rPr>
   </w:style>
-  <w:style w:type="character" w:customStyle="1" w:styleId="PiedepginaCar">
-    <w:name w:val="Pie de página Car"/>
-    <w:basedOn w:val="Fuentedeprrafopredeter"/>
-    <w:link w:val="Piedepgina"/>
+  <w:style w:type="character" w:customStyle="1" w:styleId="FooterChar">
+    <w:name w:val="Footer Char"/>
+    <w:basedOn w:val="DefaultParagraphFont"/>
+    <w:link w:val="Footer"/>
     <w:uiPriority w:val="99"/>
     <w:rsid w:val="00B330E8"/>
   </w:style>
-  <w:style w:type="table" w:styleId="Tablaconcuadrcula">
+  <w:style w:type="table" w:styleId="TableGrid">
     <w:name w:val="Table Grid"/>
-    <w:basedOn w:val="Tablanormal"/>
+    <w:basedOn w:val="TableNormal"/>
     <w:uiPriority w:val="59"/>
     <w:rsid w:val="00B330E8"/>
     <w:pPr>

</xml_diff>